<commit_message>
Entrega 1: informe en blanco y negro, pie de pagina simple
Co-Authored-By: Claude Fable 5.1 <noreply@anthropic.com>
</commit_message>
<xml_diff>
--- a/entregas/Entrega1_RAFFO.docx
+++ b/entregas/Entrega1_RAFFO.docx
@@ -12,7 +12,7 @@
           <w:noProof/>
         </w:rPr>
         <w:drawing>
-          <wp:inline distT="0" distB="0" distL="0" distR="0" wp14:anchorId="728DBF51" wp14:editId="42F17326">
+          <wp:inline distT="0" distB="0" distL="0" distR="0" wp14:anchorId="53009E57" wp14:editId="59C74625">
             <wp:extent cx="1466850" cy="314325"/>
             <wp:effectExtent l="0" t="0" r="0" b="0"/>
             <wp:docPr id="1" name="Imagen 1"/>
@@ -130,7 +130,7 @@
         <w:rPr>
           <w:b/>
           <w:bCs/>
-          <w:color w:val="1F3864"/>
+          <w:color w:val="000000"/>
           <w:sz w:val="32"/>
           <w:szCs w:val="32"/>
         </w:rPr>
@@ -146,7 +146,7 @@
         <w:rPr>
           <w:b/>
           <w:bCs/>
-          <w:color w:val="1F3864"/>
+          <w:color w:val="000000"/>
           <w:sz w:val="24"/>
           <w:szCs w:val="24"/>
         </w:rPr>
@@ -170,7 +170,7 @@
           <w:sz w:val="24"/>
           <w:szCs w:val="24"/>
         </w:rPr>
-        <w:t>Equipo docente:</w:t>
+        <w:t>Docente:</w:t>
       </w:r>
     </w:p>
     <w:p>
@@ -179,7 +179,7 @@
         <w:jc w:val="center"/>
       </w:pPr>
       <w:r>
-        <w:t>Del Rosso, Rodrigo · Barreto Marcano, Aquiles · Levinis, Gustavo</w:t>
+        <w:t>Barreto Marcano, Aquiles</w:t>
       </w:r>
     </w:p>
     <w:p>
@@ -245,7 +245,7 @@
         <w:rPr>
           <w:b/>
           <w:bCs/>
-          <w:color w:val="1F3864"/>
+          <w:color w:val="000000"/>
           <w:sz w:val="28"/>
           <w:szCs w:val="28"/>
         </w:rPr>
@@ -296,7 +296,7 @@
         <w:rPr>
           <w:b/>
           <w:bCs/>
-          <w:color w:val="1F3864"/>
+          <w:color w:val="000000"/>
           <w:sz w:val="28"/>
           <w:szCs w:val="28"/>
         </w:rPr>
@@ -306,7 +306,7 @@
     <w:sdt>
       <w:sdtPr>
         <w:alias w:val="Índice"/>
-        <w:id w:val="531077819"/>
+        <w:id w:val="1834177961"/>
       </w:sdtPr>
       <w:sdtEndPr/>
       <w:sdtContent>
@@ -334,7 +334,7 @@
           <w:r>
             <w:fldChar w:fldCharType="separate"/>
           </w:r>
-          <w:hyperlink w:anchor="_Toc240398730" w:history="1">
+          <w:hyperlink w:anchor="_Toc240399344" w:history="1">
             <w:r>
               <w:rPr>
                 <w:rStyle w:val="Hipervnculo"/>
@@ -358,7 +358,7 @@
               <w:rPr>
                 <w:noProof/>
               </w:rPr>
-              <w:instrText xml:space="preserve"> PAGEREF _Toc240398730 \h </w:instrText>
+              <w:instrText xml:space="preserve"> PAGEREF _Toc240399344 \h </w:instrText>
             </w:r>
             <w:r>
               <w:rPr>
@@ -400,7 +400,7 @@
               <w14:ligatures w14:val="standardContextual"/>
             </w:rPr>
           </w:pPr>
-          <w:hyperlink w:anchor="_Toc240398731" w:history="1">
+          <w:hyperlink w:anchor="_Toc240399345" w:history="1">
             <w:r>
               <w:rPr>
                 <w:rStyle w:val="Hipervnculo"/>
@@ -424,7 +424,7 @@
               <w:rPr>
                 <w:noProof/>
               </w:rPr>
-              <w:instrText xml:space="preserve"> PAGEREF _Toc240398731 \h </w:instrText>
+              <w:instrText xml:space="preserve"> PAGEREF _Toc240399345 \h </w:instrText>
             </w:r>
             <w:r>
               <w:rPr>
@@ -466,7 +466,7 @@
               <w14:ligatures w14:val="standardContextual"/>
             </w:rPr>
           </w:pPr>
-          <w:hyperlink w:anchor="_Toc240398732" w:history="1">
+          <w:hyperlink w:anchor="_Toc240399346" w:history="1">
             <w:r>
               <w:rPr>
                 <w:rStyle w:val="Hipervnculo"/>
@@ -490,7 +490,7 @@
               <w:rPr>
                 <w:noProof/>
               </w:rPr>
-              <w:instrText xml:space="preserve"> PAGEREF _Toc240398732 \h </w:instrText>
+              <w:instrText xml:space="preserve"> PAGEREF _Toc240399346 \h </w:instrText>
             </w:r>
             <w:r>
               <w:rPr>
@@ -532,7 +532,7 @@
               <w14:ligatures w14:val="standardContextual"/>
             </w:rPr>
           </w:pPr>
-          <w:hyperlink w:anchor="_Toc240398733" w:history="1">
+          <w:hyperlink w:anchor="_Toc240399347" w:history="1">
             <w:r>
               <w:rPr>
                 <w:rStyle w:val="Hipervnculo"/>
@@ -556,7 +556,7 @@
               <w:rPr>
                 <w:noProof/>
               </w:rPr>
-              <w:instrText xml:space="preserve"> PAGEREF _Toc240398733 \h </w:instrText>
+              <w:instrText xml:space="preserve"> PAGEREF _Toc240399347 \h </w:instrText>
             </w:r>
             <w:r>
               <w:rPr>
@@ -598,7 +598,7 @@
               <w14:ligatures w14:val="standardContextual"/>
             </w:rPr>
           </w:pPr>
-          <w:hyperlink w:anchor="_Toc240398734" w:history="1">
+          <w:hyperlink w:anchor="_Toc240399348" w:history="1">
             <w:r>
               <w:rPr>
                 <w:rStyle w:val="Hipervnculo"/>
@@ -622,7 +622,7 @@
               <w:rPr>
                 <w:noProof/>
               </w:rPr>
-              <w:instrText xml:space="preserve"> PAGEREF _Toc240398734 \h </w:instrText>
+              <w:instrText xml:space="preserve"> PAGEREF _Toc240399348 \h </w:instrText>
             </w:r>
             <w:r>
               <w:rPr>
@@ -664,7 +664,7 @@
               <w14:ligatures w14:val="standardContextual"/>
             </w:rPr>
           </w:pPr>
-          <w:hyperlink w:anchor="_Toc240398735" w:history="1">
+          <w:hyperlink w:anchor="_Toc240399349" w:history="1">
             <w:r>
               <w:rPr>
                 <w:rStyle w:val="Hipervnculo"/>
@@ -688,7 +688,7 @@
               <w:rPr>
                 <w:noProof/>
               </w:rPr>
-              <w:instrText xml:space="preserve"> PAGEREF _Toc240398735 \h </w:instrText>
+              <w:instrText xml:space="preserve"> PAGEREF _Toc240399349 \h </w:instrText>
             </w:r>
             <w:r>
               <w:rPr>
@@ -730,7 +730,7 @@
               <w14:ligatures w14:val="standardContextual"/>
             </w:rPr>
           </w:pPr>
-          <w:hyperlink w:anchor="_Toc240398736" w:history="1">
+          <w:hyperlink w:anchor="_Toc240399350" w:history="1">
             <w:r>
               <w:rPr>
                 <w:rStyle w:val="Hipervnculo"/>
@@ -754,7 +754,7 @@
               <w:rPr>
                 <w:noProof/>
               </w:rPr>
-              <w:instrText xml:space="preserve"> PAGEREF _Toc240398736 \h </w:instrText>
+              <w:instrText xml:space="preserve"> PAGEREF _Toc240399350 \h </w:instrText>
             </w:r>
             <w:r>
               <w:rPr>
@@ -796,7 +796,7 @@
               <w14:ligatures w14:val="standardContextual"/>
             </w:rPr>
           </w:pPr>
-          <w:hyperlink w:anchor="_Toc240398737" w:history="1">
+          <w:hyperlink w:anchor="_Toc240399351" w:history="1">
             <w:r>
               <w:rPr>
                 <w:rStyle w:val="Hipervnculo"/>
@@ -820,7 +820,7 @@
               <w:rPr>
                 <w:noProof/>
               </w:rPr>
-              <w:instrText xml:space="preserve"> PAGEREF _Toc240398737 \h </w:instrText>
+              <w:instrText xml:space="preserve"> PAGEREF _Toc240399351 \h </w:instrText>
             </w:r>
             <w:r>
               <w:rPr>
@@ -862,7 +862,7 @@
               <w14:ligatures w14:val="standardContextual"/>
             </w:rPr>
           </w:pPr>
-          <w:hyperlink w:anchor="_Toc240398738" w:history="1">
+          <w:hyperlink w:anchor="_Toc240399352" w:history="1">
             <w:r>
               <w:rPr>
                 <w:rStyle w:val="Hipervnculo"/>
@@ -886,7 +886,7 @@
               <w:rPr>
                 <w:noProof/>
               </w:rPr>
-              <w:instrText xml:space="preserve"> PAGEREF _Toc240398738 \h </w:instrText>
+              <w:instrText xml:space="preserve"> PAGEREF _Toc240399352 \h </w:instrText>
             </w:r>
             <w:r>
               <w:rPr>
@@ -928,7 +928,7 @@
               <w14:ligatures w14:val="standardContextual"/>
             </w:rPr>
           </w:pPr>
-          <w:hyperlink w:anchor="_Toc240398739" w:history="1">
+          <w:hyperlink w:anchor="_Toc240399353" w:history="1">
             <w:r>
               <w:rPr>
                 <w:rStyle w:val="Hipervnculo"/>
@@ -952,7 +952,7 @@
               <w:rPr>
                 <w:noProof/>
               </w:rPr>
-              <w:instrText xml:space="preserve"> PAGEREF _Toc240398739 \h </w:instrText>
+              <w:instrText xml:space="preserve"> PAGEREF _Toc240399353 \h </w:instrText>
             </w:r>
             <w:r>
               <w:rPr>
@@ -994,7 +994,7 @@
               <w14:ligatures w14:val="standardContextual"/>
             </w:rPr>
           </w:pPr>
-          <w:hyperlink w:anchor="_Toc240398740" w:history="1">
+          <w:hyperlink w:anchor="_Toc240399354" w:history="1">
             <w:r>
               <w:rPr>
                 <w:rStyle w:val="Hipervnculo"/>
@@ -1018,7 +1018,7 @@
               <w:rPr>
                 <w:noProof/>
               </w:rPr>
-              <w:instrText xml:space="preserve"> PAGEREF _Toc240398740 \h </w:instrText>
+              <w:instrText xml:space="preserve"> PAGEREF _Toc240399354 \h </w:instrText>
             </w:r>
             <w:r>
               <w:rPr>
@@ -1060,7 +1060,7 @@
               <w14:ligatures w14:val="standardContextual"/>
             </w:rPr>
           </w:pPr>
-          <w:hyperlink w:anchor="_Toc240398741" w:history="1">
+          <w:hyperlink w:anchor="_Toc240399355" w:history="1">
             <w:r>
               <w:rPr>
                 <w:rStyle w:val="Hipervnculo"/>
@@ -1084,7 +1084,7 @@
               <w:rPr>
                 <w:noProof/>
               </w:rPr>
-              <w:instrText xml:space="preserve"> PAGEREF _Toc240398741 \h </w:instrText>
+              <w:instrText xml:space="preserve"> PAGEREF _Toc240399355 \h </w:instrText>
             </w:r>
             <w:r>
               <w:rPr>
@@ -1126,7 +1126,7 @@
               <w14:ligatures w14:val="standardContextual"/>
             </w:rPr>
           </w:pPr>
-          <w:hyperlink w:anchor="_Toc240398742" w:history="1">
+          <w:hyperlink w:anchor="_Toc240399356" w:history="1">
             <w:r>
               <w:rPr>
                 <w:rStyle w:val="Hipervnculo"/>
@@ -1150,7 +1150,7 @@
               <w:rPr>
                 <w:noProof/>
               </w:rPr>
-              <w:instrText xml:space="preserve"> PAGEREF _Toc240398742 \h </w:instrText>
+              <w:instrText xml:space="preserve"> PAGEREF _Toc240399356 \h </w:instrText>
             </w:r>
             <w:r>
               <w:rPr>
@@ -1192,7 +1192,7 @@
               <w14:ligatures w14:val="standardContextual"/>
             </w:rPr>
           </w:pPr>
-          <w:hyperlink w:anchor="_Toc240398743" w:history="1">
+          <w:hyperlink w:anchor="_Toc240399357" w:history="1">
             <w:r>
               <w:rPr>
                 <w:rStyle w:val="Hipervnculo"/>
@@ -1216,7 +1216,7 @@
               <w:rPr>
                 <w:noProof/>
               </w:rPr>
-              <w:instrText xml:space="preserve"> PAGEREF _Toc240398743 \h </w:instrText>
+              <w:instrText xml:space="preserve"> PAGEREF _Toc240399357 \h </w:instrText>
             </w:r>
             <w:r>
               <w:rPr>
@@ -1258,7 +1258,7 @@
               <w14:ligatures w14:val="standardContextual"/>
             </w:rPr>
           </w:pPr>
-          <w:hyperlink w:anchor="_Toc240398744" w:history="1">
+          <w:hyperlink w:anchor="_Toc240399358" w:history="1">
             <w:r>
               <w:rPr>
                 <w:rStyle w:val="Hipervnculo"/>
@@ -1282,7 +1282,7 @@
               <w:rPr>
                 <w:noProof/>
               </w:rPr>
-              <w:instrText xml:space="preserve"> PAGEREF _Toc240398744 \h </w:instrText>
+              <w:instrText xml:space="preserve"> PAGEREF _Toc240399358 \h </w:instrText>
             </w:r>
             <w:r>
               <w:rPr>
@@ -1324,7 +1324,7 @@
               <w14:ligatures w14:val="standardContextual"/>
             </w:rPr>
           </w:pPr>
-          <w:hyperlink w:anchor="_Toc240398745" w:history="1">
+          <w:hyperlink w:anchor="_Toc240399359" w:history="1">
             <w:r>
               <w:rPr>
                 <w:rStyle w:val="Hipervnculo"/>
@@ -1348,7 +1348,7 @@
               <w:rPr>
                 <w:noProof/>
               </w:rPr>
-              <w:instrText xml:space="preserve"> PAGEREF _Toc240398745 \h </w:instrText>
+              <w:instrText xml:space="preserve"> PAGEREF _Toc240399359 \h </w:instrText>
             </w:r>
             <w:r>
               <w:rPr>
@@ -1390,7 +1390,7 @@
               <w14:ligatures w14:val="standardContextual"/>
             </w:rPr>
           </w:pPr>
-          <w:hyperlink w:anchor="_Toc240398746" w:history="1">
+          <w:hyperlink w:anchor="_Toc240399360" w:history="1">
             <w:r>
               <w:rPr>
                 <w:rStyle w:val="Hipervnculo"/>
@@ -1414,7 +1414,7 @@
               <w:rPr>
                 <w:noProof/>
               </w:rPr>
-              <w:instrText xml:space="preserve"> PAGEREF _Toc240398746 \h </w:instrText>
+              <w:instrText xml:space="preserve"> PAGEREF _Toc240399360 \h </w:instrText>
             </w:r>
             <w:r>
               <w:rPr>
@@ -1456,7 +1456,7 @@
               <w14:ligatures w14:val="standardContextual"/>
             </w:rPr>
           </w:pPr>
-          <w:hyperlink w:anchor="_Toc240398747" w:history="1">
+          <w:hyperlink w:anchor="_Toc240399361" w:history="1">
             <w:r>
               <w:rPr>
                 <w:rStyle w:val="Hipervnculo"/>
@@ -1480,7 +1480,7 @@
               <w:rPr>
                 <w:noProof/>
               </w:rPr>
-              <w:instrText xml:space="preserve"> PAGEREF _Toc240398747 \h </w:instrText>
+              <w:instrText xml:space="preserve"> PAGEREF _Toc240399361 \h </w:instrText>
             </w:r>
             <w:r>
               <w:rPr>
@@ -1523,7 +1523,7 @@
       <w:pPr>
         <w:pStyle w:val="Ttulo1"/>
       </w:pPr>
-      <w:bookmarkStart w:id="0" w:name="_Toc240398730"/>
+      <w:bookmarkStart w:id="0" w:name="_Toc240399344"/>
       <w:r>
         <w:t>1. INTRODUCCIÓN</w:t>
       </w:r>
@@ -1560,7 +1560,7 @@
       <w:pPr>
         <w:pStyle w:val="Ttulo1"/>
       </w:pPr>
-      <w:bookmarkStart w:id="1" w:name="_Toc240398731"/>
+      <w:bookmarkStart w:id="1" w:name="_Toc240399345"/>
       <w:r>
         <w:t>2. LOS DATOS</w:t>
       </w:r>
@@ -1570,7 +1570,7 @@
       <w:pPr>
         <w:pStyle w:val="Ttulo2"/>
       </w:pPr>
-      <w:bookmarkStart w:id="2" w:name="_Toc240398732"/>
+      <w:bookmarkStart w:id="2" w:name="_Toc240399346"/>
       <w:r>
         <w:t>2.1 Descripción de las variables</w:t>
       </w:r>
@@ -1614,7 +1614,7 @@
           <w:left w:w="10" w:type="dxa"/>
           <w:right w:w="10" w:type="dxa"/>
         </w:tblCellMar>
-        <w:tblLook w:val="04A0" w:firstRow="1" w:lastRow="0" w:firstColumn="1" w:lastColumn="0" w:noHBand="0" w:noVBand="1"/>
+        <w:tblLook w:val="0000" w:firstRow="0" w:lastRow="0" w:firstColumn="0" w:lastColumn="0" w:noHBand="0" w:noVBand="0"/>
       </w:tblPr>
       <w:tblGrid>
         <w:gridCol w:w="1700"/>
@@ -1634,7 +1634,7 @@
         <w:tc>
           <w:tcPr>
             <w:tcW w:w="1700" w:type="dxa"/>
-            <w:shd w:val="clear" w:color="auto" w:fill="D9E2F3"/>
+            <w:shd w:val="clear" w:color="auto" w:fill="E7E6E6"/>
             <w:tcMar>
               <w:top w:w="60" w:type="dxa"/>
               <w:left w:w="100" w:type="dxa"/>
@@ -1657,7 +1657,7 @@
         <w:tc>
           <w:tcPr>
             <w:tcW w:w="4000" w:type="dxa"/>
-            <w:shd w:val="clear" w:color="auto" w:fill="D9E2F3"/>
+            <w:shd w:val="clear" w:color="auto" w:fill="E7E6E6"/>
             <w:tcMar>
               <w:top w:w="60" w:type="dxa"/>
               <w:left w:w="100" w:type="dxa"/>
@@ -1680,7 +1680,7 @@
         <w:tc>
           <w:tcPr>
             <w:tcW w:w="3326" w:type="dxa"/>
-            <w:shd w:val="clear" w:color="auto" w:fill="D9E2F3"/>
+            <w:shd w:val="clear" w:color="auto" w:fill="E7E6E6"/>
             <w:tcMar>
               <w:top w:w="60" w:type="dxa"/>
               <w:left w:w="100" w:type="dxa"/>
@@ -2265,7 +2265,7 @@
       <w:pPr>
         <w:pStyle w:val="Ttulo2"/>
       </w:pPr>
-      <w:bookmarkStart w:id="3" w:name="_Toc240398733"/>
+      <w:bookmarkStart w:id="3" w:name="_Toc240399347"/>
       <w:r>
         <w:t>2.2 Calidad de los datos</w:t>
       </w:r>
@@ -2304,10 +2304,10 @@
           <w:noProof/>
         </w:rPr>
         <w:drawing>
-          <wp:inline distT="0" distB="0" distL="0" distR="0" wp14:anchorId="43DB41DC" wp14:editId="4D7A7295">
+          <wp:inline distT="0" distB="0" distL="0" distR="0" wp14:anchorId="4CDAF1C7" wp14:editId="067A2E32">
             <wp:extent cx="5667375" cy="2038350"/>
             <wp:effectExtent l="0" t="0" r="0" b="0"/>
-            <wp:docPr id="1554930825" name="Imagen 1554930825"/>
+            <wp:docPr id="1289589195" name="Imagen 1289589195"/>
             <wp:cNvGraphicFramePr>
               <a:graphicFrameLocks xmlns:a="http://schemas.openxmlformats.org/drawingml/2006/main" noChangeAspect="1"/>
             </wp:cNvGraphicFramePr>
@@ -2362,7 +2362,7 @@
       <w:pPr>
         <w:pStyle w:val="Ttulo1"/>
       </w:pPr>
-      <w:bookmarkStart w:id="4" w:name="_Toc240398734"/>
+      <w:bookmarkStart w:id="4" w:name="_Toc240399348"/>
       <w:r>
         <w:t>3. ANÁLISIS EXPLORATORIO DE LOS DATOS</w:t>
       </w:r>
@@ -2401,10 +2401,10 @@
           <w:noProof/>
         </w:rPr>
         <w:drawing>
-          <wp:inline distT="0" distB="0" distL="0" distR="0" wp14:anchorId="6D8A99EA" wp14:editId="793F9366">
+          <wp:inline distT="0" distB="0" distL="0" distR="0" wp14:anchorId="184AF1E8" wp14:editId="0E2F1E89">
             <wp:extent cx="4933950" cy="3505200"/>
             <wp:effectExtent l="0" t="0" r="0" b="0"/>
-            <wp:docPr id="1033397276" name="Imagen 1033397276"/>
+            <wp:docPr id="857656903" name="Imagen 857656903"/>
             <wp:cNvGraphicFramePr>
               <a:graphicFrameLocks xmlns:a="http://schemas.openxmlformats.org/drawingml/2006/main" noChangeAspect="1"/>
             </wp:cNvGraphicFramePr>
@@ -2531,10 +2531,10 @@
           <w:noProof/>
         </w:rPr>
         <w:drawing>
-          <wp:inline distT="0" distB="0" distL="0" distR="0" wp14:anchorId="1706B7C1" wp14:editId="77C418CA">
+          <wp:inline distT="0" distB="0" distL="0" distR="0" wp14:anchorId="40B32BA9" wp14:editId="349ECD95">
             <wp:extent cx="5124450" cy="4572000"/>
             <wp:effectExtent l="0" t="0" r="0" b="0"/>
-            <wp:docPr id="1237073195" name="Imagen 1237073195"/>
+            <wp:docPr id="651977359" name="Imagen 651977359"/>
             <wp:cNvGraphicFramePr>
               <a:graphicFrameLocks xmlns:a="http://schemas.openxmlformats.org/drawingml/2006/main" noChangeAspect="1"/>
             </wp:cNvGraphicFramePr>
@@ -2637,7 +2637,7 @@
       <w:pPr>
         <w:pStyle w:val="Ttulo1"/>
       </w:pPr>
-      <w:bookmarkStart w:id="5" w:name="_Toc240398735"/>
+      <w:bookmarkStart w:id="5" w:name="_Toc240399349"/>
       <w:r>
         <w:t>4. PREPARACIÓN DE LOS DATOS</w:t>
       </w:r>
@@ -2647,7 +2647,7 @@
       <w:pPr>
         <w:pStyle w:val="Ttulo2"/>
       </w:pPr>
-      <w:bookmarkStart w:id="6" w:name="_Toc240398736"/>
+      <w:bookmarkStart w:id="6" w:name="_Toc240399350"/>
       <w:r>
         <w:t>4.1 Columnas eliminadas y baja varianza</w:t>
       </w:r>
@@ -2678,7 +2678,7 @@
       <w:pPr>
         <w:pStyle w:val="Ttulo2"/>
       </w:pPr>
-      <w:bookmarkStart w:id="7" w:name="_Toc240398737"/>
+      <w:bookmarkStart w:id="7" w:name="_Toc240399351"/>
       <w:r>
         <w:t>4.2 Tipos de variables y su tratamiento</w:t>
       </w:r>
@@ -2706,7 +2706,7 @@
       <w:pPr>
         <w:pStyle w:val="Ttulo2"/>
       </w:pPr>
-      <w:bookmarkStart w:id="8" w:name="_Toc240398738"/>
+      <w:bookmarkStart w:id="8" w:name="_Toc240399352"/>
       <w:r>
         <w:t>4.3 Grupo de examen y data leakage</w:t>
       </w:r>
@@ -2728,7 +2728,7 @@
       <w:pPr>
         <w:pStyle w:val="Ttulo2"/>
       </w:pPr>
-      <w:bookmarkStart w:id="9" w:name="_Toc240398739"/>
+      <w:bookmarkStart w:id="9" w:name="_Toc240399353"/>
       <w:r>
         <w:t>4.4 Pipeline de preprocesamiento</w:t>
       </w:r>
@@ -2750,7 +2750,7 @@
       <w:pPr>
         <w:pStyle w:val="Ttulo2"/>
       </w:pPr>
-      <w:bookmarkStart w:id="10" w:name="_Toc240398740"/>
+      <w:bookmarkStart w:id="10" w:name="_Toc240399354"/>
       <w:r>
         <w:t>4.5 Balance de clases</w:t>
       </w:r>
@@ -2772,7 +2772,7 @@
       <w:pPr>
         <w:pStyle w:val="Ttulo2"/>
       </w:pPr>
-      <w:bookmarkStart w:id="11" w:name="_Toc240398741"/>
+      <w:bookmarkStart w:id="11" w:name="_Toc240399355"/>
       <w:r>
         <w:t>4.6 Transformaciones y componentes principales</w:t>
       </w:r>
@@ -2820,10 +2820,10 @@
           <w:noProof/>
         </w:rPr>
         <w:drawing>
-          <wp:inline distT="0" distB="0" distL="0" distR="0" wp14:anchorId="38F7E7A2" wp14:editId="197DFB36">
+          <wp:inline distT="0" distB="0" distL="0" distR="0" wp14:anchorId="4B41A924" wp14:editId="3102A604">
             <wp:extent cx="4933950" cy="2657475"/>
             <wp:effectExtent l="0" t="0" r="0" b="0"/>
-            <wp:docPr id="628756663" name="Imagen 628756663"/>
+            <wp:docPr id="56989747" name="Imagen 56989747"/>
             <wp:cNvGraphicFramePr>
               <a:graphicFrameLocks xmlns:a="http://schemas.openxmlformats.org/drawingml/2006/main" noChangeAspect="1"/>
             </wp:cNvGraphicFramePr>
@@ -2878,7 +2878,7 @@
       <w:pPr>
         <w:pStyle w:val="Ttulo2"/>
       </w:pPr>
-      <w:bookmarkStart w:id="12" w:name="_Toc240398742"/>
+      <w:bookmarkStart w:id="12" w:name="_Toc240399356"/>
       <w:r>
         <w:t>4.7 Ranking de variables</w:t>
       </w:r>
@@ -2917,10 +2917,10 @@
           <w:noProof/>
         </w:rPr>
         <w:drawing>
-          <wp:inline distT="0" distB="0" distL="0" distR="0" wp14:anchorId="111AF36D" wp14:editId="51F967E6">
+          <wp:inline distT="0" distB="0" distL="0" distR="0" wp14:anchorId="4DA7BC6C" wp14:editId="36F45453">
             <wp:extent cx="4933950" cy="3009900"/>
             <wp:effectExtent l="0" t="0" r="0" b="0"/>
-            <wp:docPr id="855907807" name="Imagen 855907807"/>
+            <wp:docPr id="1043787860" name="Imagen 1043787860"/>
             <wp:cNvGraphicFramePr>
               <a:graphicFrameLocks xmlns:a="http://schemas.openxmlformats.org/drawingml/2006/main" noChangeAspect="1"/>
             </wp:cNvGraphicFramePr>
@@ -2975,7 +2975,7 @@
       <w:pPr>
         <w:pStyle w:val="Ttulo2"/>
       </w:pPr>
-      <w:bookmarkStart w:id="13" w:name="_Toc240398743"/>
+      <w:bookmarkStart w:id="13" w:name="_Toc240399357"/>
       <w:r>
         <w:t>4.8 Dataset final</w:t>
       </w:r>
@@ -2994,7 +2994,7 @@
       <w:pPr>
         <w:pStyle w:val="Ttulo1"/>
       </w:pPr>
-      <w:bookmarkStart w:id="14" w:name="_Toc240398744"/>
+      <w:bookmarkStart w:id="14" w:name="_Toc240399358"/>
       <w:r>
         <w:t>5. BASELINE</w:t>
       </w:r>
@@ -3038,7 +3038,7 @@
           <w:left w:w="10" w:type="dxa"/>
           <w:right w:w="10" w:type="dxa"/>
         </w:tblCellMar>
-        <w:tblLook w:val="04A0" w:firstRow="1" w:lastRow="0" w:firstColumn="1" w:lastColumn="0" w:noHBand="0" w:noVBand="1"/>
+        <w:tblLook w:val="0000" w:firstRow="0" w:lastRow="0" w:firstColumn="0" w:lastColumn="0" w:noHBand="0" w:noVBand="0"/>
       </w:tblPr>
       <w:tblGrid>
         <w:gridCol w:w="2900"/>
@@ -3058,7 +3058,7 @@
         <w:tc>
           <w:tcPr>
             <w:tcW w:w="2900" w:type="dxa"/>
-            <w:shd w:val="clear" w:color="auto" w:fill="D9E2F3"/>
+            <w:shd w:val="clear" w:color="auto" w:fill="E7E6E6"/>
             <w:tcMar>
               <w:top w:w="60" w:type="dxa"/>
               <w:left w:w="100" w:type="dxa"/>
@@ -3081,7 +3081,7 @@
         <w:tc>
           <w:tcPr>
             <w:tcW w:w="1400" w:type="dxa"/>
-            <w:shd w:val="clear" w:color="auto" w:fill="D9E2F3"/>
+            <w:shd w:val="clear" w:color="auto" w:fill="E7E6E6"/>
             <w:tcMar>
               <w:top w:w="60" w:type="dxa"/>
               <w:left w:w="100" w:type="dxa"/>
@@ -3104,7 +3104,7 @@
         <w:tc>
           <w:tcPr>
             <w:tcW w:w="4726" w:type="dxa"/>
-            <w:shd w:val="clear" w:color="auto" w:fill="D9E2F3"/>
+            <w:shd w:val="clear" w:color="auto" w:fill="E7E6E6"/>
             <w:tcMar>
               <w:top w:w="60" w:type="dxa"/>
               <w:left w:w="100" w:type="dxa"/>
@@ -3358,7 +3358,7 @@
       <w:pPr>
         <w:pStyle w:val="Ttulo1"/>
       </w:pPr>
-      <w:bookmarkStart w:id="15" w:name="_Toc240398745"/>
+      <w:bookmarkStart w:id="15" w:name="_Toc240399359"/>
       <w:r>
         <w:t>6. CONCLUSIONES</w:t>
       </w:r>
@@ -3405,7 +3405,7 @@
           <w:left w:w="10" w:type="dxa"/>
           <w:right w:w="10" w:type="dxa"/>
         </w:tblCellMar>
-        <w:tblLook w:val="04A0" w:firstRow="1" w:lastRow="0" w:firstColumn="1" w:lastColumn="0" w:noHBand="0" w:noVBand="1"/>
+        <w:tblLook w:val="0000" w:firstRow="0" w:lastRow="0" w:firstColumn="0" w:lastColumn="0" w:noHBand="0" w:noVBand="0"/>
       </w:tblPr>
       <w:tblGrid>
         <w:gridCol w:w="3000"/>
@@ -3424,7 +3424,7 @@
         <w:tc>
           <w:tcPr>
             <w:tcW w:w="3000" w:type="dxa"/>
-            <w:shd w:val="clear" w:color="auto" w:fill="D9E2F3"/>
+            <w:shd w:val="clear" w:color="auto" w:fill="E7E6E6"/>
             <w:tcMar>
               <w:top w:w="60" w:type="dxa"/>
               <w:left w:w="100" w:type="dxa"/>
@@ -3447,7 +3447,7 @@
         <w:tc>
           <w:tcPr>
             <w:tcW w:w="6026" w:type="dxa"/>
-            <w:shd w:val="clear" w:color="auto" w:fill="D9E2F3"/>
+            <w:shd w:val="clear" w:color="auto" w:fill="E7E6E6"/>
             <w:tcMar>
               <w:top w:w="60" w:type="dxa"/>
               <w:left w:w="100" w:type="dxa"/>
@@ -4121,7 +4121,7 @@
       <w:pPr>
         <w:pStyle w:val="Ttulo1"/>
       </w:pPr>
-      <w:bookmarkStart w:id="16" w:name="_Toc240398746"/>
+      <w:bookmarkStart w:id="16" w:name="_Toc240399360"/>
       <w:r>
         <w:t>7. LINK COLAB Y REPOSITORIO</w:t>
       </w:r>
@@ -4186,7 +4186,7 @@
       <w:pPr>
         <w:pStyle w:val="Ttulo1"/>
       </w:pPr>
-      <w:bookmarkStart w:id="17" w:name="_Toc240398747"/>
+      <w:bookmarkStart w:id="17" w:name="_Toc240399361"/>
       <w:r>
         <w:t>8. REFERENCIAS</w:t>
       </w:r>
@@ -4304,54 +4304,41 @@
 <w:ftr xmlns:wpc="http://schemas.microsoft.com/office/word/2010/wordprocessingCanvas" xmlns:cx="http://schemas.microsoft.com/office/drawing/2014/chartex" xmlns:cx1="http://schemas.microsoft.com/office/drawing/2015/9/8/chartex" xmlns:cx2="http://schemas.microsoft.com/office/drawing/2015/10/21/chartex" xmlns:cx3="http://schemas.microsoft.com/office/drawing/2016/5/9/chartex" xmlns:cx4="http://schemas.microsoft.com/office/drawing/2016/5/10/chartex" xmlns:cx5="http://schemas.microsoft.com/office/drawing/2016/5/11/chartex" xmlns:cx6="http://schemas.microsoft.com/office/drawing/2016/5/12/chartex" xmlns:cx7="http://schemas.microsoft.com/office/drawing/2016/5/13/chartex" xmlns:cx8="http://schemas.microsoft.com/office/drawing/2016/5/14/chartex" xmlns:mc="http://schemas.openxmlformats.org/markup-compatibility/2006" xmlns:aink="http://schemas.microsoft.com/office/drawing/2016/ink" xmlns:am3d="http://schemas.microsoft.com/office/drawing/2017/model3d" xmlns:o="urn:schemas-microsoft-com:office:office" xmlns:oel="http://schemas.microsoft.com/office/2019/extlst" xmlns:r="http://schemas.openxmlformats.org/officeDocument/2006/relationships" xmlns:m="http://schemas.openxmlformats.org/officeDocument/2006/math" xmlns:v="urn:schemas-microsoft-com:vml" xmlns:wp14="http://schemas.microsoft.com/office/word/2010/wordprocessingDrawing" xmlns:wp="http://schemas.openxmlformats.org/drawingml/2006/wordprocessingDrawing" xmlns:w10="urn:schemas-microsoft-com:office:word" xmlns:w="http://schemas.openxmlformats.org/wordprocessingml/2006/main" xmlns:w14="http://schemas.microsoft.com/office/word/2010/wordml" xmlns:w15="http://schemas.microsoft.com/office/word/2012/wordml" xmlns:w16cex="http://schemas.microsoft.com/office/word/2018/wordml/cex" xmlns:w16cid="http://schemas.microsoft.com/office/word/2016/wordml/cid" xmlns:w16="http://schemas.microsoft.com/office/word/2018/wordml" xmlns:w16du="http://schemas.microsoft.com/office/word/2023/wordml/word16du" xmlns:w16sdtdh="http://schemas.microsoft.com/office/word/2020/wordml/sdtdatahash" xmlns:w16sdtfl="http://schemas.microsoft.com/office/word/2024/wordml/sdtformatlock" xmlns:w16se="http://schemas.microsoft.com/office/word/2015/wordml/symex" xmlns:wpg="http://schemas.microsoft.com/office/word/2010/wordprocessingGroup" xmlns:wpi="http://schemas.microsoft.com/office/word/2010/wordprocessingInk" xmlns:wne="http://schemas.microsoft.com/office/word/2006/wordml" xmlns:wps="http://schemas.microsoft.com/office/word/2010/wordprocessingShape" mc:Ignorable="w14 w15 w16se w16cid w16 w16cex w16sdtdh w16sdtfl w16du wp14">
   <w:p>
     <w:pPr>
-      <w:jc w:val="right"/>
+      <w:jc w:val="center"/>
     </w:pPr>
     <w:r>
       <w:rPr>
-        <w:color w:val="7F7F7F"/>
-        <w:sz w:val="16"/>
-        <w:szCs w:val="16"/>
-      </w:rPr>
-      <w:t xml:space="preserve">Trabajo Final – Entrega 1 · Raffo Romero, G. · Página </w:t>
-    </w:r>
-    <w:r>
-      <w:rPr>
-        <w:color w:val="7F7F7F"/>
-        <w:sz w:val="16"/>
-        <w:szCs w:val="16"/>
+        <w:sz w:val="18"/>
+        <w:szCs w:val="18"/>
       </w:rPr>
       <w:fldChar w:fldCharType="begin"/>
     </w:r>
     <w:r>
       <w:rPr>
-        <w:color w:val="7F7F7F"/>
-        <w:sz w:val="16"/>
-        <w:szCs w:val="16"/>
+        <w:sz w:val="18"/>
+        <w:szCs w:val="18"/>
       </w:rPr>
       <w:instrText>PAGE</w:instrText>
     </w:r>
     <w:r>
       <w:rPr>
-        <w:color w:val="7F7F7F"/>
-        <w:sz w:val="16"/>
-        <w:szCs w:val="16"/>
+        <w:sz w:val="18"/>
+        <w:szCs w:val="18"/>
       </w:rPr>
       <w:fldChar w:fldCharType="separate"/>
     </w:r>
     <w:r>
       <w:rPr>
         <w:noProof/>
-        <w:color w:val="7F7F7F"/>
-        <w:sz w:val="16"/>
-        <w:szCs w:val="16"/>
+        <w:sz w:val="18"/>
+        <w:szCs w:val="18"/>
       </w:rPr>
       <w:t>1</w:t>
     </w:r>
     <w:r>
       <w:rPr>
-        <w:color w:val="7F7F7F"/>
-        <w:sz w:val="16"/>
-        <w:szCs w:val="16"/>
+        <w:sz w:val="18"/>
+        <w:szCs w:val="18"/>
       </w:rPr>
       <w:fldChar w:fldCharType="end"/>
     </w:r>
@@ -4381,10 +4368,10 @@
 <file path=word/numbering.xml><?xml version="1.0" encoding="utf-8"?>
 <w:numbering xmlns:wpc="http://schemas.microsoft.com/office/word/2010/wordprocessingCanvas" xmlns:cx="http://schemas.microsoft.com/office/drawing/2014/chartex" xmlns:cx1="http://schemas.microsoft.com/office/drawing/2015/9/8/chartex" xmlns:cx2="http://schemas.microsoft.com/office/drawing/2015/10/21/chartex" xmlns:cx3="http://schemas.microsoft.com/office/drawing/2016/5/9/chartex" xmlns:cx4="http://schemas.microsoft.com/office/drawing/2016/5/10/chartex" xmlns:cx5="http://schemas.microsoft.com/office/drawing/2016/5/11/chartex" xmlns:cx6="http://schemas.microsoft.com/office/drawing/2016/5/12/chartex" xmlns:cx7="http://schemas.microsoft.com/office/drawing/2016/5/13/chartex" xmlns:cx8="http://schemas.microsoft.com/office/drawing/2016/5/14/chartex" xmlns:mc="http://schemas.openxmlformats.org/markup-compatibility/2006" xmlns:aink="http://schemas.microsoft.com/office/drawing/2016/ink" xmlns:am3d="http://schemas.microsoft.com/office/drawing/2017/model3d" xmlns:o="urn:schemas-microsoft-com:office:office" xmlns:oel="http://schemas.microsoft.com/office/2019/extlst" xmlns:r="http://schemas.openxmlformats.org/officeDocument/2006/relationships" xmlns:m="http://schemas.openxmlformats.org/officeDocument/2006/math" xmlns:v="urn:schemas-microsoft-com:vml" xmlns:wp14="http://schemas.microsoft.com/office/word/2010/wordprocessingDrawing" xmlns:wp="http://schemas.openxmlformats.org/drawingml/2006/wordprocessingDrawing" xmlns:w10="urn:schemas-microsoft-com:office:word" xmlns:w="http://schemas.openxmlformats.org/wordprocessingml/2006/main" xmlns:w14="http://schemas.microsoft.com/office/word/2010/wordml" xmlns:w15="http://schemas.microsoft.com/office/word/2012/wordml" xmlns:w16cex="http://schemas.microsoft.com/office/word/2018/wordml/cex" xmlns:w16cid="http://schemas.microsoft.com/office/word/2016/wordml/cid" xmlns:w16="http://schemas.microsoft.com/office/word/2018/wordml" xmlns:w16du="http://schemas.microsoft.com/office/word/2023/wordml/word16du" xmlns:w16sdtdh="http://schemas.microsoft.com/office/word/2020/wordml/sdtdatahash" xmlns:w16sdtfl="http://schemas.microsoft.com/office/word/2024/wordml/sdtformatlock" xmlns:w16se="http://schemas.microsoft.com/office/word/2015/wordml/symex" xmlns:wpg="http://schemas.microsoft.com/office/word/2010/wordprocessingGroup" xmlns:wpi="http://schemas.microsoft.com/office/word/2010/wordprocessingInk" xmlns:wne="http://schemas.microsoft.com/office/word/2006/wordml" xmlns:wps="http://schemas.microsoft.com/office/word/2010/wordprocessingShape" mc:Ignorable="w14 w15 w16se w16cid w16 w16cex w16sdtdh w16sdtfl w16du wp14">
   <w:abstractNum w:abstractNumId="0" w15:restartNumberingAfterBreak="0">
-    <w:nsid w:val="676130F1"/>
+    <w:nsid w:val="0BA56BF4"/>
     <w:multiLevelType w:val="hybridMultilevel"/>
-    <w:tmpl w:val="40E0288C"/>
-    <w:lvl w:ilvl="0" w:tplc="EC586A78">
+    <w:tmpl w:val="8E3E6D0A"/>
+    <w:lvl w:ilvl="0" w:tplc="A056AFB4">
       <w:start w:val="1"/>
       <w:numFmt w:val="bullet"/>
       <w:lvlText w:val="●"/>
@@ -4393,7 +4380,7 @@
         <w:ind w:left="720" w:hanging="360"/>
       </w:pPr>
     </w:lvl>
-    <w:lvl w:ilvl="1" w:tplc="F5E4E458">
+    <w:lvl w:ilvl="1" w:tplc="39B8BF48">
       <w:start w:val="1"/>
       <w:numFmt w:val="bullet"/>
       <w:lvlText w:val="○"/>
@@ -4402,7 +4389,7 @@
         <w:ind w:left="1440" w:hanging="360"/>
       </w:pPr>
     </w:lvl>
-    <w:lvl w:ilvl="2" w:tplc="C5BEB788">
+    <w:lvl w:ilvl="2" w:tplc="B7E8F88A">
       <w:start w:val="1"/>
       <w:numFmt w:val="bullet"/>
       <w:lvlText w:val="■"/>
@@ -4411,7 +4398,7 @@
         <w:ind w:left="2160" w:hanging="360"/>
       </w:pPr>
     </w:lvl>
-    <w:lvl w:ilvl="3" w:tplc="8BEC7432">
+    <w:lvl w:ilvl="3" w:tplc="79229386">
       <w:start w:val="1"/>
       <w:numFmt w:val="bullet"/>
       <w:lvlText w:val="●"/>
@@ -4420,7 +4407,7 @@
         <w:ind w:left="2880" w:hanging="360"/>
       </w:pPr>
     </w:lvl>
-    <w:lvl w:ilvl="4" w:tplc="19D0C608">
+    <w:lvl w:ilvl="4" w:tplc="0DCCBFE0">
       <w:start w:val="1"/>
       <w:numFmt w:val="bullet"/>
       <w:lvlText w:val="○"/>
@@ -4429,7 +4416,7 @@
         <w:ind w:left="3600" w:hanging="360"/>
       </w:pPr>
     </w:lvl>
-    <w:lvl w:ilvl="5" w:tplc="D1E024AA">
+    <w:lvl w:ilvl="5" w:tplc="7B6EC758">
       <w:start w:val="1"/>
       <w:numFmt w:val="bullet"/>
       <w:lvlText w:val="■"/>
@@ -4438,7 +4425,7 @@
         <w:ind w:left="4320" w:hanging="360"/>
       </w:pPr>
     </w:lvl>
-    <w:lvl w:ilvl="6" w:tplc="0F7C5A72">
+    <w:lvl w:ilvl="6" w:tplc="F7E83E98">
       <w:start w:val="1"/>
       <w:numFmt w:val="bullet"/>
       <w:lvlText w:val="●"/>
@@ -4447,7 +4434,7 @@
         <w:ind w:left="5040" w:hanging="360"/>
       </w:pPr>
     </w:lvl>
-    <w:lvl w:ilvl="7" w:tplc="347E1482">
+    <w:lvl w:ilvl="7" w:tplc="D3FE5834">
       <w:start w:val="1"/>
       <w:numFmt w:val="bullet"/>
       <w:lvlText w:val="●"/>
@@ -4456,7 +4443,7 @@
         <w:ind w:left="5760" w:hanging="360"/>
       </w:pPr>
     </w:lvl>
-    <w:lvl w:ilvl="8" w:tplc="108AC29C">
+    <w:lvl w:ilvl="8" w:tplc="5F2EBEBA">
       <w:start w:val="1"/>
       <w:numFmt w:val="bullet"/>
       <w:lvlText w:val="●"/>
@@ -4467,10 +4454,10 @@
     </w:lvl>
   </w:abstractNum>
   <w:abstractNum w:abstractNumId="1" w15:restartNumberingAfterBreak="0">
-    <w:nsid w:val="6D187DC5"/>
+    <w:nsid w:val="4D765CE6"/>
     <w:multiLevelType w:val="hybridMultilevel"/>
-    <w:tmpl w:val="695ED43A"/>
-    <w:lvl w:ilvl="0" w:tplc="4DFE9FA8">
+    <w:tmpl w:val="660C7302"/>
+    <w:lvl w:ilvl="0" w:tplc="97AC4D18">
       <w:start w:val="1"/>
       <w:numFmt w:val="bullet"/>
       <w:lvlText w:val="•"/>
@@ -4479,54 +4466,54 @@
         <w:ind w:left="720" w:hanging="360"/>
       </w:pPr>
     </w:lvl>
-    <w:lvl w:ilvl="1" w:tplc="95EAC2C8">
+    <w:lvl w:ilvl="1" w:tplc="F9D64FEA">
       <w:numFmt w:val="decimal"/>
       <w:lvlText w:val=""/>
       <w:lvlJc w:val="left"/>
     </w:lvl>
-    <w:lvl w:ilvl="2" w:tplc="EE5833F8">
+    <w:lvl w:ilvl="2" w:tplc="324CDF7A">
       <w:numFmt w:val="decimal"/>
       <w:lvlText w:val=""/>
       <w:lvlJc w:val="left"/>
     </w:lvl>
-    <w:lvl w:ilvl="3" w:tplc="261EBE66">
+    <w:lvl w:ilvl="3" w:tplc="FE743D34">
       <w:numFmt w:val="decimal"/>
       <w:lvlText w:val=""/>
       <w:lvlJc w:val="left"/>
     </w:lvl>
-    <w:lvl w:ilvl="4" w:tplc="ED823592">
+    <w:lvl w:ilvl="4" w:tplc="48845C04">
       <w:numFmt w:val="decimal"/>
       <w:lvlText w:val=""/>
       <w:lvlJc w:val="left"/>
     </w:lvl>
-    <w:lvl w:ilvl="5" w:tplc="AB0EEBA6">
+    <w:lvl w:ilvl="5" w:tplc="701ECD00">
       <w:numFmt w:val="decimal"/>
       <w:lvlText w:val=""/>
       <w:lvlJc w:val="left"/>
     </w:lvl>
-    <w:lvl w:ilvl="6" w:tplc="D94CF392">
+    <w:lvl w:ilvl="6" w:tplc="110E82AE">
       <w:numFmt w:val="decimal"/>
       <w:lvlText w:val=""/>
       <w:lvlJc w:val="left"/>
     </w:lvl>
-    <w:lvl w:ilvl="7" w:tplc="C1BCC052">
+    <w:lvl w:ilvl="7" w:tplc="DE68C910">
       <w:numFmt w:val="decimal"/>
       <w:lvlText w:val=""/>
       <w:lvlJc w:val="left"/>
     </w:lvl>
-    <w:lvl w:ilvl="8" w:tplc="AC64F38A">
+    <w:lvl w:ilvl="8" w:tplc="178A4DAA">
       <w:numFmt w:val="decimal"/>
       <w:lvlText w:val=""/>
       <w:lvlJc w:val="left"/>
     </w:lvl>
   </w:abstractNum>
-  <w:num w:numId="1" w16cid:durableId="1432971500">
+  <w:num w:numId="1" w16cid:durableId="50926711">
     <w:abstractNumId w:val="0"/>
     <w:lvlOverride w:ilvl="0">
       <w:startOverride w:val="1"/>
     </w:lvlOverride>
   </w:num>
-  <w:num w:numId="2" w16cid:durableId="1076053581">
+  <w:num w:numId="2" w16cid:durableId="156921404">
     <w:abstractNumId w:val="1"/>
     <w:lvlOverride w:ilvl="0">
       <w:startOverride w:val="1"/>
@@ -4942,7 +4929,7 @@
     <w:rPr>
       <w:b/>
       <w:bCs/>
-      <w:color w:val="1F3864"/>
+      <w:color w:val="000000"/>
       <w:sz w:val="30"/>
       <w:szCs w:val="30"/>
     </w:rPr>
@@ -4960,7 +4947,7 @@
     <w:rPr>
       <w:b/>
       <w:bCs/>
-      <w:color w:val="1F3864"/>
+      <w:color w:val="000000"/>
       <w:sz w:val="25"/>
       <w:szCs w:val="25"/>
     </w:rPr>
@@ -5074,7 +5061,7 @@
     <w:uiPriority w:val="99"/>
     <w:unhideWhenUsed/>
     <w:rPr>
-      <w:color w:val="0563C1"/>
+      <w:color w:val="000000"/>
       <w:u w:val="single"/>
     </w:rPr>
   </w:style>
@@ -5147,7 +5134,7 @@
     <w:autoRedefine/>
     <w:uiPriority w:val="39"/>
     <w:unhideWhenUsed/>
-    <w:rsid w:val="00E34361"/>
+    <w:rsid w:val="00C304A3"/>
     <w:pPr>
       <w:spacing w:after="100"/>
     </w:pPr>
@@ -5159,7 +5146,7 @@
     <w:autoRedefine/>
     <w:uiPriority w:val="39"/>
     <w:unhideWhenUsed/>
-    <w:rsid w:val="00E34361"/>
+    <w:rsid w:val="00C304A3"/>
     <w:pPr>
       <w:spacing w:after="100"/>
       <w:ind w:left="220"/>

</xml_diff>

<commit_message>
Entrega 1: informe solo con el link de Colab
Co-Authored-By: Claude Fable 5.1 <noreply@anthropic.com>
</commit_message>
<xml_diff>
--- a/entregas/Entrega1_RAFFO.docx
+++ b/entregas/Entrega1_RAFFO.docx
@@ -12,7 +12,7 @@
           <w:noProof/>
         </w:rPr>
         <w:drawing>
-          <wp:inline distT="0" distB="0" distL="0" distR="0" wp14:anchorId="53009E57" wp14:editId="59C74625">
+          <wp:inline distT="0" distB="0" distL="0" distR="0" wp14:anchorId="5F214EB3" wp14:editId="1BD50A70">
             <wp:extent cx="1466850" cy="314325"/>
             <wp:effectExtent l="0" t="0" r="0" b="0"/>
             <wp:docPr id="1" name="Imagen 1"/>
@@ -306,7 +306,7 @@
     <w:sdt>
       <w:sdtPr>
         <w:alias w:val="Índice"/>
-        <w:id w:val="1834177961"/>
+        <w:id w:val="-827047268"/>
       </w:sdtPr>
       <w:sdtEndPr/>
       <w:sdtContent>
@@ -334,7 +334,7 @@
           <w:r>
             <w:fldChar w:fldCharType="separate"/>
           </w:r>
-          <w:hyperlink w:anchor="_Toc240399344" w:history="1">
+          <w:hyperlink w:anchor="_Toc240400502" w:history="1">
             <w:r>
               <w:rPr>
                 <w:rStyle w:val="Hipervnculo"/>
@@ -358,7 +358,7 @@
               <w:rPr>
                 <w:noProof/>
               </w:rPr>
-              <w:instrText xml:space="preserve"> PAGEREF _Toc240399344 \h </w:instrText>
+              <w:instrText xml:space="preserve"> PAGEREF _Toc240400502 \h </w:instrText>
             </w:r>
             <w:r>
               <w:rPr>
@@ -400,7 +400,7 @@
               <w14:ligatures w14:val="standardContextual"/>
             </w:rPr>
           </w:pPr>
-          <w:hyperlink w:anchor="_Toc240399345" w:history="1">
+          <w:hyperlink w:anchor="_Toc240400503" w:history="1">
             <w:r>
               <w:rPr>
                 <w:rStyle w:val="Hipervnculo"/>
@@ -424,7 +424,7 @@
               <w:rPr>
                 <w:noProof/>
               </w:rPr>
-              <w:instrText xml:space="preserve"> PAGEREF _Toc240399345 \h </w:instrText>
+              <w:instrText xml:space="preserve"> PAGEREF _Toc240400503 \h </w:instrText>
             </w:r>
             <w:r>
               <w:rPr>
@@ -466,7 +466,7 @@
               <w14:ligatures w14:val="standardContextual"/>
             </w:rPr>
           </w:pPr>
-          <w:hyperlink w:anchor="_Toc240399346" w:history="1">
+          <w:hyperlink w:anchor="_Toc240400504" w:history="1">
             <w:r>
               <w:rPr>
                 <w:rStyle w:val="Hipervnculo"/>
@@ -490,7 +490,7 @@
               <w:rPr>
                 <w:noProof/>
               </w:rPr>
-              <w:instrText xml:space="preserve"> PAGEREF _Toc240399346 \h </w:instrText>
+              <w:instrText xml:space="preserve"> PAGEREF _Toc240400504 \h </w:instrText>
             </w:r>
             <w:r>
               <w:rPr>
@@ -532,7 +532,7 @@
               <w14:ligatures w14:val="standardContextual"/>
             </w:rPr>
           </w:pPr>
-          <w:hyperlink w:anchor="_Toc240399347" w:history="1">
+          <w:hyperlink w:anchor="_Toc240400505" w:history="1">
             <w:r>
               <w:rPr>
                 <w:rStyle w:val="Hipervnculo"/>
@@ -556,7 +556,7 @@
               <w:rPr>
                 <w:noProof/>
               </w:rPr>
-              <w:instrText xml:space="preserve"> PAGEREF _Toc240399347 \h </w:instrText>
+              <w:instrText xml:space="preserve"> PAGEREF _Toc240400505 \h </w:instrText>
             </w:r>
             <w:r>
               <w:rPr>
@@ -598,7 +598,7 @@
               <w14:ligatures w14:val="standardContextual"/>
             </w:rPr>
           </w:pPr>
-          <w:hyperlink w:anchor="_Toc240399348" w:history="1">
+          <w:hyperlink w:anchor="_Toc240400506" w:history="1">
             <w:r>
               <w:rPr>
                 <w:rStyle w:val="Hipervnculo"/>
@@ -622,7 +622,7 @@
               <w:rPr>
                 <w:noProof/>
               </w:rPr>
-              <w:instrText xml:space="preserve"> PAGEREF _Toc240399348 \h </w:instrText>
+              <w:instrText xml:space="preserve"> PAGEREF _Toc240400506 \h </w:instrText>
             </w:r>
             <w:r>
               <w:rPr>
@@ -664,7 +664,7 @@
               <w14:ligatures w14:val="standardContextual"/>
             </w:rPr>
           </w:pPr>
-          <w:hyperlink w:anchor="_Toc240399349" w:history="1">
+          <w:hyperlink w:anchor="_Toc240400507" w:history="1">
             <w:r>
               <w:rPr>
                 <w:rStyle w:val="Hipervnculo"/>
@@ -688,7 +688,7 @@
               <w:rPr>
                 <w:noProof/>
               </w:rPr>
-              <w:instrText xml:space="preserve"> PAGEREF _Toc240399349 \h </w:instrText>
+              <w:instrText xml:space="preserve"> PAGEREF _Toc240400507 \h </w:instrText>
             </w:r>
             <w:r>
               <w:rPr>
@@ -730,7 +730,7 @@
               <w14:ligatures w14:val="standardContextual"/>
             </w:rPr>
           </w:pPr>
-          <w:hyperlink w:anchor="_Toc240399350" w:history="1">
+          <w:hyperlink w:anchor="_Toc240400508" w:history="1">
             <w:r>
               <w:rPr>
                 <w:rStyle w:val="Hipervnculo"/>
@@ -754,7 +754,7 @@
               <w:rPr>
                 <w:noProof/>
               </w:rPr>
-              <w:instrText xml:space="preserve"> PAGEREF _Toc240399350 \h </w:instrText>
+              <w:instrText xml:space="preserve"> PAGEREF _Toc240400508 \h </w:instrText>
             </w:r>
             <w:r>
               <w:rPr>
@@ -796,7 +796,7 @@
               <w14:ligatures w14:val="standardContextual"/>
             </w:rPr>
           </w:pPr>
-          <w:hyperlink w:anchor="_Toc240399351" w:history="1">
+          <w:hyperlink w:anchor="_Toc240400509" w:history="1">
             <w:r>
               <w:rPr>
                 <w:rStyle w:val="Hipervnculo"/>
@@ -820,7 +820,7 @@
               <w:rPr>
                 <w:noProof/>
               </w:rPr>
-              <w:instrText xml:space="preserve"> PAGEREF _Toc240399351 \h </w:instrText>
+              <w:instrText xml:space="preserve"> PAGEREF _Toc240400509 \h </w:instrText>
             </w:r>
             <w:r>
               <w:rPr>
@@ -862,7 +862,7 @@
               <w14:ligatures w14:val="standardContextual"/>
             </w:rPr>
           </w:pPr>
-          <w:hyperlink w:anchor="_Toc240399352" w:history="1">
+          <w:hyperlink w:anchor="_Toc240400510" w:history="1">
             <w:r>
               <w:rPr>
                 <w:rStyle w:val="Hipervnculo"/>
@@ -886,7 +886,7 @@
               <w:rPr>
                 <w:noProof/>
               </w:rPr>
-              <w:instrText xml:space="preserve"> PAGEREF _Toc240399352 \h </w:instrText>
+              <w:instrText xml:space="preserve"> PAGEREF _Toc240400510 \h </w:instrText>
             </w:r>
             <w:r>
               <w:rPr>
@@ -928,7 +928,7 @@
               <w14:ligatures w14:val="standardContextual"/>
             </w:rPr>
           </w:pPr>
-          <w:hyperlink w:anchor="_Toc240399353" w:history="1">
+          <w:hyperlink w:anchor="_Toc240400511" w:history="1">
             <w:r>
               <w:rPr>
                 <w:rStyle w:val="Hipervnculo"/>
@@ -952,7 +952,7 @@
               <w:rPr>
                 <w:noProof/>
               </w:rPr>
-              <w:instrText xml:space="preserve"> PAGEREF _Toc240399353 \h </w:instrText>
+              <w:instrText xml:space="preserve"> PAGEREF _Toc240400511 \h </w:instrText>
             </w:r>
             <w:r>
               <w:rPr>
@@ -994,7 +994,7 @@
               <w14:ligatures w14:val="standardContextual"/>
             </w:rPr>
           </w:pPr>
-          <w:hyperlink w:anchor="_Toc240399354" w:history="1">
+          <w:hyperlink w:anchor="_Toc240400512" w:history="1">
             <w:r>
               <w:rPr>
                 <w:rStyle w:val="Hipervnculo"/>
@@ -1018,7 +1018,7 @@
               <w:rPr>
                 <w:noProof/>
               </w:rPr>
-              <w:instrText xml:space="preserve"> PAGEREF _Toc240399354 \h </w:instrText>
+              <w:instrText xml:space="preserve"> PAGEREF _Toc240400512 \h </w:instrText>
             </w:r>
             <w:r>
               <w:rPr>
@@ -1060,7 +1060,7 @@
               <w14:ligatures w14:val="standardContextual"/>
             </w:rPr>
           </w:pPr>
-          <w:hyperlink w:anchor="_Toc240399355" w:history="1">
+          <w:hyperlink w:anchor="_Toc240400513" w:history="1">
             <w:r>
               <w:rPr>
                 <w:rStyle w:val="Hipervnculo"/>
@@ -1084,7 +1084,7 @@
               <w:rPr>
                 <w:noProof/>
               </w:rPr>
-              <w:instrText xml:space="preserve"> PAGEREF _Toc240399355 \h </w:instrText>
+              <w:instrText xml:space="preserve"> PAGEREF _Toc240400513 \h </w:instrText>
             </w:r>
             <w:r>
               <w:rPr>
@@ -1126,7 +1126,7 @@
               <w14:ligatures w14:val="standardContextual"/>
             </w:rPr>
           </w:pPr>
-          <w:hyperlink w:anchor="_Toc240399356" w:history="1">
+          <w:hyperlink w:anchor="_Toc240400514" w:history="1">
             <w:r>
               <w:rPr>
                 <w:rStyle w:val="Hipervnculo"/>
@@ -1150,7 +1150,7 @@
               <w:rPr>
                 <w:noProof/>
               </w:rPr>
-              <w:instrText xml:space="preserve"> PAGEREF _Toc240399356 \h </w:instrText>
+              <w:instrText xml:space="preserve"> PAGEREF _Toc240400514 \h </w:instrText>
             </w:r>
             <w:r>
               <w:rPr>
@@ -1192,7 +1192,7 @@
               <w14:ligatures w14:val="standardContextual"/>
             </w:rPr>
           </w:pPr>
-          <w:hyperlink w:anchor="_Toc240399357" w:history="1">
+          <w:hyperlink w:anchor="_Toc240400515" w:history="1">
             <w:r>
               <w:rPr>
                 <w:rStyle w:val="Hipervnculo"/>
@@ -1216,7 +1216,7 @@
               <w:rPr>
                 <w:noProof/>
               </w:rPr>
-              <w:instrText xml:space="preserve"> PAGEREF _Toc240399357 \h </w:instrText>
+              <w:instrText xml:space="preserve"> PAGEREF _Toc240400515 \h </w:instrText>
             </w:r>
             <w:r>
               <w:rPr>
@@ -1258,7 +1258,7 @@
               <w14:ligatures w14:val="standardContextual"/>
             </w:rPr>
           </w:pPr>
-          <w:hyperlink w:anchor="_Toc240399358" w:history="1">
+          <w:hyperlink w:anchor="_Toc240400516" w:history="1">
             <w:r>
               <w:rPr>
                 <w:rStyle w:val="Hipervnculo"/>
@@ -1282,7 +1282,7 @@
               <w:rPr>
                 <w:noProof/>
               </w:rPr>
-              <w:instrText xml:space="preserve"> PAGEREF _Toc240399358 \h </w:instrText>
+              <w:instrText xml:space="preserve"> PAGEREF _Toc240400516 \h </w:instrText>
             </w:r>
             <w:r>
               <w:rPr>
@@ -1324,7 +1324,7 @@
               <w14:ligatures w14:val="standardContextual"/>
             </w:rPr>
           </w:pPr>
-          <w:hyperlink w:anchor="_Toc240399359" w:history="1">
+          <w:hyperlink w:anchor="_Toc240400517" w:history="1">
             <w:r>
               <w:rPr>
                 <w:rStyle w:val="Hipervnculo"/>
@@ -1348,7 +1348,7 @@
               <w:rPr>
                 <w:noProof/>
               </w:rPr>
-              <w:instrText xml:space="preserve"> PAGEREF _Toc240399359 \h </w:instrText>
+              <w:instrText xml:space="preserve"> PAGEREF _Toc240400517 \h </w:instrText>
             </w:r>
             <w:r>
               <w:rPr>
@@ -1390,13 +1390,13 @@
               <w14:ligatures w14:val="standardContextual"/>
             </w:rPr>
           </w:pPr>
-          <w:hyperlink w:anchor="_Toc240399360" w:history="1">
+          <w:hyperlink w:anchor="_Toc240400518" w:history="1">
             <w:r>
               <w:rPr>
                 <w:rStyle w:val="Hipervnculo"/>
                 <w:noProof/>
               </w:rPr>
-              <w:t>7. LINK COLAB Y REPOSITORIO</w:t>
+              <w:t>7. LINK COLAB</w:t>
             </w:r>
             <w:r>
               <w:rPr>
@@ -1414,7 +1414,7 @@
               <w:rPr>
                 <w:noProof/>
               </w:rPr>
-              <w:instrText xml:space="preserve"> PAGEREF _Toc240399360 \h </w:instrText>
+              <w:instrText xml:space="preserve"> PAGEREF _Toc240400518 \h </w:instrText>
             </w:r>
             <w:r>
               <w:rPr>
@@ -1456,7 +1456,7 @@
               <w14:ligatures w14:val="standardContextual"/>
             </w:rPr>
           </w:pPr>
-          <w:hyperlink w:anchor="_Toc240399361" w:history="1">
+          <w:hyperlink w:anchor="_Toc240400519" w:history="1">
             <w:r>
               <w:rPr>
                 <w:rStyle w:val="Hipervnculo"/>
@@ -1480,7 +1480,7 @@
               <w:rPr>
                 <w:noProof/>
               </w:rPr>
-              <w:instrText xml:space="preserve"> PAGEREF _Toc240399361 \h </w:instrText>
+              <w:instrText xml:space="preserve"> PAGEREF _Toc240400519 \h </w:instrText>
             </w:r>
             <w:r>
               <w:rPr>
@@ -1523,7 +1523,7 @@
       <w:pPr>
         <w:pStyle w:val="Ttulo1"/>
       </w:pPr>
-      <w:bookmarkStart w:id="0" w:name="_Toc240399344"/>
+      <w:bookmarkStart w:id="0" w:name="_Toc240400502"/>
       <w:r>
         <w:t>1. INTRODUCCIÓN</w:t>
       </w:r>
@@ -1560,7 +1560,7 @@
       <w:pPr>
         <w:pStyle w:val="Ttulo1"/>
       </w:pPr>
-      <w:bookmarkStart w:id="1" w:name="_Toc240399345"/>
+      <w:bookmarkStart w:id="1" w:name="_Toc240400503"/>
       <w:r>
         <w:t>2. LOS DATOS</w:t>
       </w:r>
@@ -1570,7 +1570,7 @@
       <w:pPr>
         <w:pStyle w:val="Ttulo2"/>
       </w:pPr>
-      <w:bookmarkStart w:id="2" w:name="_Toc240399346"/>
+      <w:bookmarkStart w:id="2" w:name="_Toc240400504"/>
       <w:r>
         <w:t>2.1 Descripción de las variables</w:t>
       </w:r>
@@ -1614,7 +1614,7 @@
           <w:left w:w="10" w:type="dxa"/>
           <w:right w:w="10" w:type="dxa"/>
         </w:tblCellMar>
-        <w:tblLook w:val="0000" w:firstRow="0" w:lastRow="0" w:firstColumn="0" w:lastColumn="0" w:noHBand="0" w:noVBand="0"/>
+        <w:tblLook w:val="04A0" w:firstRow="1" w:lastRow="0" w:firstColumn="1" w:lastColumn="0" w:noHBand="0" w:noVBand="1"/>
       </w:tblPr>
       <w:tblGrid>
         <w:gridCol w:w="1700"/>
@@ -2265,7 +2265,7 @@
       <w:pPr>
         <w:pStyle w:val="Ttulo2"/>
       </w:pPr>
-      <w:bookmarkStart w:id="3" w:name="_Toc240399347"/>
+      <w:bookmarkStart w:id="3" w:name="_Toc240400505"/>
       <w:r>
         <w:t>2.2 Calidad de los datos</w:t>
       </w:r>
@@ -2304,10 +2304,10 @@
           <w:noProof/>
         </w:rPr>
         <w:drawing>
-          <wp:inline distT="0" distB="0" distL="0" distR="0" wp14:anchorId="4CDAF1C7" wp14:editId="067A2E32">
+          <wp:inline distT="0" distB="0" distL="0" distR="0" wp14:anchorId="56FE2342" wp14:editId="6E9B7A22">
             <wp:extent cx="5667375" cy="2038350"/>
             <wp:effectExtent l="0" t="0" r="0" b="0"/>
-            <wp:docPr id="1289589195" name="Imagen 1289589195"/>
+            <wp:docPr id="1967028203" name="Imagen 1967028203"/>
             <wp:cNvGraphicFramePr>
               <a:graphicFrameLocks xmlns:a="http://schemas.openxmlformats.org/drawingml/2006/main" noChangeAspect="1"/>
             </wp:cNvGraphicFramePr>
@@ -2362,7 +2362,7 @@
       <w:pPr>
         <w:pStyle w:val="Ttulo1"/>
       </w:pPr>
-      <w:bookmarkStart w:id="4" w:name="_Toc240399348"/>
+      <w:bookmarkStart w:id="4" w:name="_Toc240400506"/>
       <w:r>
         <w:t>3. ANÁLISIS EXPLORATORIO DE LOS DATOS</w:t>
       </w:r>
@@ -2401,10 +2401,10 @@
           <w:noProof/>
         </w:rPr>
         <w:drawing>
-          <wp:inline distT="0" distB="0" distL="0" distR="0" wp14:anchorId="184AF1E8" wp14:editId="0E2F1E89">
+          <wp:inline distT="0" distB="0" distL="0" distR="0" wp14:anchorId="5DA95E6A" wp14:editId="4597F049">
             <wp:extent cx="4933950" cy="3505200"/>
             <wp:effectExtent l="0" t="0" r="0" b="0"/>
-            <wp:docPr id="857656903" name="Imagen 857656903"/>
+            <wp:docPr id="405625498" name="Imagen 405625498"/>
             <wp:cNvGraphicFramePr>
               <a:graphicFrameLocks xmlns:a="http://schemas.openxmlformats.org/drawingml/2006/main" noChangeAspect="1"/>
             </wp:cNvGraphicFramePr>
@@ -2531,10 +2531,10 @@
           <w:noProof/>
         </w:rPr>
         <w:drawing>
-          <wp:inline distT="0" distB="0" distL="0" distR="0" wp14:anchorId="40B32BA9" wp14:editId="349ECD95">
+          <wp:inline distT="0" distB="0" distL="0" distR="0" wp14:anchorId="70E9E9F2" wp14:editId="58C0E96A">
             <wp:extent cx="5124450" cy="4572000"/>
             <wp:effectExtent l="0" t="0" r="0" b="0"/>
-            <wp:docPr id="651977359" name="Imagen 651977359"/>
+            <wp:docPr id="1780297659" name="Imagen 1780297659"/>
             <wp:cNvGraphicFramePr>
               <a:graphicFrameLocks xmlns:a="http://schemas.openxmlformats.org/drawingml/2006/main" noChangeAspect="1"/>
             </wp:cNvGraphicFramePr>
@@ -2630,14 +2630,14 @@
         <w:jc w:val="both"/>
       </w:pPr>
       <w:r>
-        <w:t>Se generó además un reporte automático de exploración con Sweetviz, con la distribución de cada variable y su relación con la renuncia, disponible en el repositorio del trabajo (reports/eda_sweetviz.html).</w:t>
+        <w:t>Se generó además un reporte automático de exploración con Sweetviz, con la distribución de cada variable y su relación con la renuncia, que el cuaderno produce al ejecutarse (reports/eda_sweetviz.html).</w:t>
       </w:r>
     </w:p>
     <w:p>
       <w:pPr>
         <w:pStyle w:val="Ttulo1"/>
       </w:pPr>
-      <w:bookmarkStart w:id="5" w:name="_Toc240399349"/>
+      <w:bookmarkStart w:id="5" w:name="_Toc240400507"/>
       <w:r>
         <w:t>4. PREPARACIÓN DE LOS DATOS</w:t>
       </w:r>
@@ -2647,7 +2647,7 @@
       <w:pPr>
         <w:pStyle w:val="Ttulo2"/>
       </w:pPr>
-      <w:bookmarkStart w:id="6" w:name="_Toc240399350"/>
+      <w:bookmarkStart w:id="6" w:name="_Toc240400508"/>
       <w:r>
         <w:t>4.1 Columnas eliminadas y baja varianza</w:t>
       </w:r>
@@ -2678,7 +2678,7 @@
       <w:pPr>
         <w:pStyle w:val="Ttulo2"/>
       </w:pPr>
-      <w:bookmarkStart w:id="7" w:name="_Toc240399351"/>
+      <w:bookmarkStart w:id="7" w:name="_Toc240400509"/>
       <w:r>
         <w:t>4.2 Tipos de variables y su tratamiento</w:t>
       </w:r>
@@ -2706,7 +2706,7 @@
       <w:pPr>
         <w:pStyle w:val="Ttulo2"/>
       </w:pPr>
-      <w:bookmarkStart w:id="8" w:name="_Toc240399352"/>
+      <w:bookmarkStart w:id="8" w:name="_Toc240400510"/>
       <w:r>
         <w:t>4.3 Grupo de examen y data leakage</w:t>
       </w:r>
@@ -2728,7 +2728,7 @@
       <w:pPr>
         <w:pStyle w:val="Ttulo2"/>
       </w:pPr>
-      <w:bookmarkStart w:id="9" w:name="_Toc240399353"/>
+      <w:bookmarkStart w:id="9" w:name="_Toc240400511"/>
       <w:r>
         <w:t>4.4 Pipeline de preprocesamiento</w:t>
       </w:r>
@@ -2750,7 +2750,7 @@
       <w:pPr>
         <w:pStyle w:val="Ttulo2"/>
       </w:pPr>
-      <w:bookmarkStart w:id="10" w:name="_Toc240399354"/>
+      <w:bookmarkStart w:id="10" w:name="_Toc240400512"/>
       <w:r>
         <w:t>4.5 Balance de clases</w:t>
       </w:r>
@@ -2772,7 +2772,7 @@
       <w:pPr>
         <w:pStyle w:val="Ttulo2"/>
       </w:pPr>
-      <w:bookmarkStart w:id="11" w:name="_Toc240399355"/>
+      <w:bookmarkStart w:id="11" w:name="_Toc240400513"/>
       <w:r>
         <w:t>4.6 Transformaciones y componentes principales</w:t>
       </w:r>
@@ -2820,10 +2820,10 @@
           <w:noProof/>
         </w:rPr>
         <w:drawing>
-          <wp:inline distT="0" distB="0" distL="0" distR="0" wp14:anchorId="4B41A924" wp14:editId="3102A604">
+          <wp:inline distT="0" distB="0" distL="0" distR="0" wp14:anchorId="7BC77520" wp14:editId="2DE542DD">
             <wp:extent cx="4933950" cy="2657475"/>
             <wp:effectExtent l="0" t="0" r="0" b="0"/>
-            <wp:docPr id="56989747" name="Imagen 56989747"/>
+            <wp:docPr id="2043873994" name="Imagen 2043873994"/>
             <wp:cNvGraphicFramePr>
               <a:graphicFrameLocks xmlns:a="http://schemas.openxmlformats.org/drawingml/2006/main" noChangeAspect="1"/>
             </wp:cNvGraphicFramePr>
@@ -2878,7 +2878,7 @@
       <w:pPr>
         <w:pStyle w:val="Ttulo2"/>
       </w:pPr>
-      <w:bookmarkStart w:id="12" w:name="_Toc240399356"/>
+      <w:bookmarkStart w:id="12" w:name="_Toc240400514"/>
       <w:r>
         <w:t>4.7 Ranking de variables</w:t>
       </w:r>
@@ -2917,10 +2917,10 @@
           <w:noProof/>
         </w:rPr>
         <w:drawing>
-          <wp:inline distT="0" distB="0" distL="0" distR="0" wp14:anchorId="4DA7BC6C" wp14:editId="36F45453">
+          <wp:inline distT="0" distB="0" distL="0" distR="0" wp14:anchorId="4F42E409" wp14:editId="54331F9C">
             <wp:extent cx="4933950" cy="3009900"/>
             <wp:effectExtent l="0" t="0" r="0" b="0"/>
-            <wp:docPr id="1043787860" name="Imagen 1043787860"/>
+            <wp:docPr id="323902291" name="Imagen 323902291"/>
             <wp:cNvGraphicFramePr>
               <a:graphicFrameLocks xmlns:a="http://schemas.openxmlformats.org/drawingml/2006/main" noChangeAspect="1"/>
             </wp:cNvGraphicFramePr>
@@ -2975,7 +2975,7 @@
       <w:pPr>
         <w:pStyle w:val="Ttulo2"/>
       </w:pPr>
-      <w:bookmarkStart w:id="13" w:name="_Toc240399357"/>
+      <w:bookmarkStart w:id="13" w:name="_Toc240400515"/>
       <w:r>
         <w:t>4.8 Dataset final</w:t>
       </w:r>
@@ -2987,14 +2987,14 @@
         <w:jc w:val="both"/>
       </w:pPr>
       <w:r>
-        <w:t>Se entregan en la carpeta data/procesado del repositorio tres archivos: el dataset limpio con los valores originales y sin las columnas eliminadas (1.470 empleados × 30 columnas), y los grupos de entrenamiento (1.176 × 49) y examen (294 × 49) ya transformados por el pipeline, incluida la variable objetivo. El modelo de la Entrega 2 se entrena aplicando el pipeline a los datos crudos; estos archivos constituyen la fotografía entregable de ese proceso.</w:t>
+        <w:t>El cuaderno genera en la carpeta data/procesado tres archivos: el dataset limpio con los valores originales y sin las columnas eliminadas (1.470 empleados × 30 columnas), y los grupos de entrenamiento (1.176 × 49) y examen (294 × 49) ya transformados por el pipeline, incluida la variable objetivo. El modelo de la Entrega 2 se entrena aplicando el pipeline a los datos crudos; estos archivos constituyen la fotografía entregable de ese proceso.</w:t>
       </w:r>
     </w:p>
     <w:p>
       <w:pPr>
         <w:pStyle w:val="Ttulo1"/>
       </w:pPr>
-      <w:bookmarkStart w:id="14" w:name="_Toc240399358"/>
+      <w:bookmarkStart w:id="14" w:name="_Toc240400516"/>
       <w:r>
         <w:t>5. BASELINE</w:t>
       </w:r>
@@ -3038,7 +3038,7 @@
           <w:left w:w="10" w:type="dxa"/>
           <w:right w:w="10" w:type="dxa"/>
         </w:tblCellMar>
-        <w:tblLook w:val="0000" w:firstRow="0" w:lastRow="0" w:firstColumn="0" w:lastColumn="0" w:noHBand="0" w:noVBand="0"/>
+        <w:tblLook w:val="04A0" w:firstRow="1" w:lastRow="0" w:firstColumn="1" w:lastColumn="0" w:noHBand="0" w:noVBand="1"/>
       </w:tblPr>
       <w:tblGrid>
         <w:gridCol w:w="2900"/>
@@ -3358,7 +3358,7 @@
       <w:pPr>
         <w:pStyle w:val="Ttulo1"/>
       </w:pPr>
-      <w:bookmarkStart w:id="15" w:name="_Toc240399359"/>
+      <w:bookmarkStart w:id="15" w:name="_Toc240400517"/>
       <w:r>
         <w:t>6. CONCLUSIONES</w:t>
       </w:r>
@@ -3405,7 +3405,7 @@
           <w:left w:w="10" w:type="dxa"/>
           <w:right w:w="10" w:type="dxa"/>
         </w:tblCellMar>
-        <w:tblLook w:val="0000" w:firstRow="0" w:lastRow="0" w:firstColumn="0" w:lastColumn="0" w:noHBand="0" w:noVBand="0"/>
+        <w:tblLook w:val="04A0" w:firstRow="1" w:lastRow="0" w:firstColumn="1" w:lastColumn="0" w:noHBand="0" w:noVBand="1"/>
       </w:tblPr>
       <w:tblGrid>
         <w:gridCol w:w="3000"/>
@@ -4121,9 +4121,9 @@
       <w:pPr>
         <w:pStyle w:val="Ttulo1"/>
       </w:pPr>
-      <w:bookmarkStart w:id="16" w:name="_Toc240399360"/>
-      <w:r>
-        <w:t>7. LINK COLAB Y REPOSITORIO</w:t>
+      <w:bookmarkStart w:id="16" w:name="_Toc240400518"/>
+      <w:r>
+        <w:t>7. LINK COLAB</w:t>
       </w:r>
       <w:bookmarkEnd w:id="16"/>
     </w:p>
@@ -4156,37 +4156,14 @@
         <w:jc w:val="both"/>
       </w:pPr>
       <w:r>
-        <w:t>Al abrirlo, seleccionar Entorno de ejecución → Ejecutar todas y aceptar el aviso "Ejecutar de todos modos" que Colab muestra para cuadernos alojados en GitHub. La primera celda descarga el repositorio e instala las librerías necesarias; la ejecución completa demora alrededor de un minuto.</w:t>
-      </w:r>
-    </w:p>
-    <w:p>
-      <w:pPr>
-        <w:keepNext/>
-        <w:spacing w:after="120" w:line="276" w:lineRule="auto"/>
-        <w:jc w:val="both"/>
-      </w:pPr>
-      <w:r>
-        <w:t>El repositorio público con el cuaderno, la versión HTML con todas las salidas, el reporte Sweetviz, el dataset final y el entorno reproducible (requirements.txt) se encuentra en:</w:t>
-      </w:r>
-    </w:p>
-    <w:p>
-      <w:pPr>
-        <w:spacing w:after="120"/>
-      </w:pPr>
-      <w:hyperlink r:id="rId14" w:history="1">
-        <w:r>
-          <w:rPr>
-            <w:rStyle w:val="Hipervnculo"/>
-          </w:rPr>
-          <w:t>https://github.com/gioaqp/attrition-uba</w:t>
-        </w:r>
-      </w:hyperlink>
+        <w:t>Al abrirlo, seleccionar Entorno de ejecución → Ejecutar todas y aceptar el aviso "Ejecutar de todos modos". La primera celda descarga los datos e instala las librerías necesarias; la ejecución completa demora alrededor de un minuto y genera, además de los resultados en pantalla, el reporte Sweetviz y los archivos del dataset final.</w:t>
+      </w:r>
     </w:p>
     <w:p>
       <w:pPr>
         <w:pStyle w:val="Ttulo1"/>
       </w:pPr>
-      <w:bookmarkStart w:id="17" w:name="_Toc240399361"/>
+      <w:bookmarkStart w:id="17" w:name="_Toc240400519"/>
       <w:r>
         <w:t>8. REFERENCIAS</w:t>
       </w:r>
@@ -4271,7 +4248,7 @@
       </w:r>
     </w:p>
     <w:sectPr>
-      <w:footerReference w:type="default" r:id="rId15"/>
+      <w:footerReference w:type="default" r:id="rId14"/>
       <w:pgSz w:w="11906" w:h="16838"/>
       <w:pgMar w:top="1300" w:right="1440" w:bottom="1300" w:left="1440" w:header="708" w:footer="708" w:gutter="0"/>
       <w:cols w:space="720"/>
@@ -4368,96 +4345,10 @@
 <file path=word/numbering.xml><?xml version="1.0" encoding="utf-8"?>
 <w:numbering xmlns:wpc="http://schemas.microsoft.com/office/word/2010/wordprocessingCanvas" xmlns:cx="http://schemas.microsoft.com/office/drawing/2014/chartex" xmlns:cx1="http://schemas.microsoft.com/office/drawing/2015/9/8/chartex" xmlns:cx2="http://schemas.microsoft.com/office/drawing/2015/10/21/chartex" xmlns:cx3="http://schemas.microsoft.com/office/drawing/2016/5/9/chartex" xmlns:cx4="http://schemas.microsoft.com/office/drawing/2016/5/10/chartex" xmlns:cx5="http://schemas.microsoft.com/office/drawing/2016/5/11/chartex" xmlns:cx6="http://schemas.microsoft.com/office/drawing/2016/5/12/chartex" xmlns:cx7="http://schemas.microsoft.com/office/drawing/2016/5/13/chartex" xmlns:cx8="http://schemas.microsoft.com/office/drawing/2016/5/14/chartex" xmlns:mc="http://schemas.openxmlformats.org/markup-compatibility/2006" xmlns:aink="http://schemas.microsoft.com/office/drawing/2016/ink" xmlns:am3d="http://schemas.microsoft.com/office/drawing/2017/model3d" xmlns:o="urn:schemas-microsoft-com:office:office" xmlns:oel="http://schemas.microsoft.com/office/2019/extlst" xmlns:r="http://schemas.openxmlformats.org/officeDocument/2006/relationships" xmlns:m="http://schemas.openxmlformats.org/officeDocument/2006/math" xmlns:v="urn:schemas-microsoft-com:vml" xmlns:wp14="http://schemas.microsoft.com/office/word/2010/wordprocessingDrawing" xmlns:wp="http://schemas.openxmlformats.org/drawingml/2006/wordprocessingDrawing" xmlns:w10="urn:schemas-microsoft-com:office:word" xmlns:w="http://schemas.openxmlformats.org/wordprocessingml/2006/main" xmlns:w14="http://schemas.microsoft.com/office/word/2010/wordml" xmlns:w15="http://schemas.microsoft.com/office/word/2012/wordml" xmlns:w16cex="http://schemas.microsoft.com/office/word/2018/wordml/cex" xmlns:w16cid="http://schemas.microsoft.com/office/word/2016/wordml/cid" xmlns:w16="http://schemas.microsoft.com/office/word/2018/wordml" xmlns:w16du="http://schemas.microsoft.com/office/word/2023/wordml/word16du" xmlns:w16sdtdh="http://schemas.microsoft.com/office/word/2020/wordml/sdtdatahash" xmlns:w16sdtfl="http://schemas.microsoft.com/office/word/2024/wordml/sdtformatlock" xmlns:w16se="http://schemas.microsoft.com/office/word/2015/wordml/symex" xmlns:wpg="http://schemas.microsoft.com/office/word/2010/wordprocessingGroup" xmlns:wpi="http://schemas.microsoft.com/office/word/2010/wordprocessingInk" xmlns:wne="http://schemas.microsoft.com/office/word/2006/wordml" xmlns:wps="http://schemas.microsoft.com/office/word/2010/wordprocessingShape" mc:Ignorable="w14 w15 w16se w16cid w16 w16cex w16sdtdh w16sdtfl w16du wp14">
   <w:abstractNum w:abstractNumId="0" w15:restartNumberingAfterBreak="0">
-    <w:nsid w:val="0BA56BF4"/>
+    <w:nsid w:val="1FB4644B"/>
     <w:multiLevelType w:val="hybridMultilevel"/>
-    <w:tmpl w:val="8E3E6D0A"/>
-    <w:lvl w:ilvl="0" w:tplc="A056AFB4">
-      <w:start w:val="1"/>
-      <w:numFmt w:val="bullet"/>
-      <w:lvlText w:val="●"/>
-      <w:lvlJc w:val="left"/>
-      <w:pPr>
-        <w:ind w:left="720" w:hanging="360"/>
-      </w:pPr>
-    </w:lvl>
-    <w:lvl w:ilvl="1" w:tplc="39B8BF48">
-      <w:start w:val="1"/>
-      <w:numFmt w:val="bullet"/>
-      <w:lvlText w:val="○"/>
-      <w:lvlJc w:val="left"/>
-      <w:pPr>
-        <w:ind w:left="1440" w:hanging="360"/>
-      </w:pPr>
-    </w:lvl>
-    <w:lvl w:ilvl="2" w:tplc="B7E8F88A">
-      <w:start w:val="1"/>
-      <w:numFmt w:val="bullet"/>
-      <w:lvlText w:val="■"/>
-      <w:lvlJc w:val="left"/>
-      <w:pPr>
-        <w:ind w:left="2160" w:hanging="360"/>
-      </w:pPr>
-    </w:lvl>
-    <w:lvl w:ilvl="3" w:tplc="79229386">
-      <w:start w:val="1"/>
-      <w:numFmt w:val="bullet"/>
-      <w:lvlText w:val="●"/>
-      <w:lvlJc w:val="left"/>
-      <w:pPr>
-        <w:ind w:left="2880" w:hanging="360"/>
-      </w:pPr>
-    </w:lvl>
-    <w:lvl w:ilvl="4" w:tplc="0DCCBFE0">
-      <w:start w:val="1"/>
-      <w:numFmt w:val="bullet"/>
-      <w:lvlText w:val="○"/>
-      <w:lvlJc w:val="left"/>
-      <w:pPr>
-        <w:ind w:left="3600" w:hanging="360"/>
-      </w:pPr>
-    </w:lvl>
-    <w:lvl w:ilvl="5" w:tplc="7B6EC758">
-      <w:start w:val="1"/>
-      <w:numFmt w:val="bullet"/>
-      <w:lvlText w:val="■"/>
-      <w:lvlJc w:val="left"/>
-      <w:pPr>
-        <w:ind w:left="4320" w:hanging="360"/>
-      </w:pPr>
-    </w:lvl>
-    <w:lvl w:ilvl="6" w:tplc="F7E83E98">
-      <w:start w:val="1"/>
-      <w:numFmt w:val="bullet"/>
-      <w:lvlText w:val="●"/>
-      <w:lvlJc w:val="left"/>
-      <w:pPr>
-        <w:ind w:left="5040" w:hanging="360"/>
-      </w:pPr>
-    </w:lvl>
-    <w:lvl w:ilvl="7" w:tplc="D3FE5834">
-      <w:start w:val="1"/>
-      <w:numFmt w:val="bullet"/>
-      <w:lvlText w:val="●"/>
-      <w:lvlJc w:val="left"/>
-      <w:pPr>
-        <w:ind w:left="5760" w:hanging="360"/>
-      </w:pPr>
-    </w:lvl>
-    <w:lvl w:ilvl="8" w:tplc="5F2EBEBA">
-      <w:start w:val="1"/>
-      <w:numFmt w:val="bullet"/>
-      <w:lvlText w:val="●"/>
-      <w:lvlJc w:val="left"/>
-      <w:pPr>
-        <w:ind w:left="6480" w:hanging="360"/>
-      </w:pPr>
-    </w:lvl>
-  </w:abstractNum>
-  <w:abstractNum w:abstractNumId="1" w15:restartNumberingAfterBreak="0">
-    <w:nsid w:val="4D765CE6"/>
-    <w:multiLevelType w:val="hybridMultilevel"/>
-    <w:tmpl w:val="660C7302"/>
-    <w:lvl w:ilvl="0" w:tplc="97AC4D18">
+    <w:tmpl w:val="99582B86"/>
+    <w:lvl w:ilvl="0" w:tplc="3E1062A8">
       <w:start w:val="1"/>
       <w:numFmt w:val="bullet"/>
       <w:lvlText w:val="•"/>
@@ -4466,55 +4357,141 @@
         <w:ind w:left="720" w:hanging="360"/>
       </w:pPr>
     </w:lvl>
-    <w:lvl w:ilvl="1" w:tplc="F9D64FEA">
+    <w:lvl w:ilvl="1" w:tplc="23061B2E">
       <w:numFmt w:val="decimal"/>
       <w:lvlText w:val=""/>
       <w:lvlJc w:val="left"/>
     </w:lvl>
-    <w:lvl w:ilvl="2" w:tplc="324CDF7A">
+    <w:lvl w:ilvl="2" w:tplc="39D634AC">
       <w:numFmt w:val="decimal"/>
       <w:lvlText w:val=""/>
       <w:lvlJc w:val="left"/>
     </w:lvl>
-    <w:lvl w:ilvl="3" w:tplc="FE743D34">
+    <w:lvl w:ilvl="3" w:tplc="22B6E2B4">
       <w:numFmt w:val="decimal"/>
       <w:lvlText w:val=""/>
       <w:lvlJc w:val="left"/>
     </w:lvl>
-    <w:lvl w:ilvl="4" w:tplc="48845C04">
+    <w:lvl w:ilvl="4" w:tplc="A0601A3C">
       <w:numFmt w:val="decimal"/>
       <w:lvlText w:val=""/>
       <w:lvlJc w:val="left"/>
     </w:lvl>
-    <w:lvl w:ilvl="5" w:tplc="701ECD00">
+    <w:lvl w:ilvl="5" w:tplc="F3129FBA">
       <w:numFmt w:val="decimal"/>
       <w:lvlText w:val=""/>
       <w:lvlJc w:val="left"/>
     </w:lvl>
-    <w:lvl w:ilvl="6" w:tplc="110E82AE">
+    <w:lvl w:ilvl="6" w:tplc="18B41310">
       <w:numFmt w:val="decimal"/>
       <w:lvlText w:val=""/>
       <w:lvlJc w:val="left"/>
     </w:lvl>
-    <w:lvl w:ilvl="7" w:tplc="DE68C910">
+    <w:lvl w:ilvl="7" w:tplc="8C82D212">
       <w:numFmt w:val="decimal"/>
       <w:lvlText w:val=""/>
       <w:lvlJc w:val="left"/>
     </w:lvl>
-    <w:lvl w:ilvl="8" w:tplc="178A4DAA">
+    <w:lvl w:ilvl="8" w:tplc="82BE2E68">
       <w:numFmt w:val="decimal"/>
       <w:lvlText w:val=""/>
       <w:lvlJc w:val="left"/>
     </w:lvl>
   </w:abstractNum>
-  <w:num w:numId="1" w16cid:durableId="50926711">
-    <w:abstractNumId w:val="0"/>
+  <w:abstractNum w:abstractNumId="1" w15:restartNumberingAfterBreak="0">
+    <w:nsid w:val="77596BEC"/>
+    <w:multiLevelType w:val="hybridMultilevel"/>
+    <w:tmpl w:val="C82E3CB0"/>
+    <w:lvl w:ilvl="0" w:tplc="A5F8A256">
+      <w:start w:val="1"/>
+      <w:numFmt w:val="bullet"/>
+      <w:lvlText w:val="●"/>
+      <w:lvlJc w:val="left"/>
+      <w:pPr>
+        <w:ind w:left="720" w:hanging="360"/>
+      </w:pPr>
+    </w:lvl>
+    <w:lvl w:ilvl="1" w:tplc="5D74C416">
+      <w:start w:val="1"/>
+      <w:numFmt w:val="bullet"/>
+      <w:lvlText w:val="○"/>
+      <w:lvlJc w:val="left"/>
+      <w:pPr>
+        <w:ind w:left="1440" w:hanging="360"/>
+      </w:pPr>
+    </w:lvl>
+    <w:lvl w:ilvl="2" w:tplc="F3247786">
+      <w:start w:val="1"/>
+      <w:numFmt w:val="bullet"/>
+      <w:lvlText w:val="■"/>
+      <w:lvlJc w:val="left"/>
+      <w:pPr>
+        <w:ind w:left="2160" w:hanging="360"/>
+      </w:pPr>
+    </w:lvl>
+    <w:lvl w:ilvl="3" w:tplc="CEB81960">
+      <w:start w:val="1"/>
+      <w:numFmt w:val="bullet"/>
+      <w:lvlText w:val="●"/>
+      <w:lvlJc w:val="left"/>
+      <w:pPr>
+        <w:ind w:left="2880" w:hanging="360"/>
+      </w:pPr>
+    </w:lvl>
+    <w:lvl w:ilvl="4" w:tplc="BE94B9C8">
+      <w:start w:val="1"/>
+      <w:numFmt w:val="bullet"/>
+      <w:lvlText w:val="○"/>
+      <w:lvlJc w:val="left"/>
+      <w:pPr>
+        <w:ind w:left="3600" w:hanging="360"/>
+      </w:pPr>
+    </w:lvl>
+    <w:lvl w:ilvl="5" w:tplc="B63A5F6E">
+      <w:start w:val="1"/>
+      <w:numFmt w:val="bullet"/>
+      <w:lvlText w:val="■"/>
+      <w:lvlJc w:val="left"/>
+      <w:pPr>
+        <w:ind w:left="4320" w:hanging="360"/>
+      </w:pPr>
+    </w:lvl>
+    <w:lvl w:ilvl="6" w:tplc="6CBE4FBA">
+      <w:start w:val="1"/>
+      <w:numFmt w:val="bullet"/>
+      <w:lvlText w:val="●"/>
+      <w:lvlJc w:val="left"/>
+      <w:pPr>
+        <w:ind w:left="5040" w:hanging="360"/>
+      </w:pPr>
+    </w:lvl>
+    <w:lvl w:ilvl="7" w:tplc="FCEA6678">
+      <w:start w:val="1"/>
+      <w:numFmt w:val="bullet"/>
+      <w:lvlText w:val="●"/>
+      <w:lvlJc w:val="left"/>
+      <w:pPr>
+        <w:ind w:left="5760" w:hanging="360"/>
+      </w:pPr>
+    </w:lvl>
+    <w:lvl w:ilvl="8" w:tplc="7E621392">
+      <w:start w:val="1"/>
+      <w:numFmt w:val="bullet"/>
+      <w:lvlText w:val="●"/>
+      <w:lvlJc w:val="left"/>
+      <w:pPr>
+        <w:ind w:left="6480" w:hanging="360"/>
+      </w:pPr>
+    </w:lvl>
+  </w:abstractNum>
+  <w:num w:numId="1" w16cid:durableId="1360593516">
+    <w:abstractNumId w:val="1"/>
     <w:lvlOverride w:ilvl="0">
       <w:startOverride w:val="1"/>
     </w:lvlOverride>
   </w:num>
-  <w:num w:numId="2" w16cid:durableId="156921404">
-    <w:abstractNumId w:val="1"/>
+  <w:num w:numId="2" w16cid:durableId="1654023311">
+    <w:abstractNumId w:val="0"/>
     <w:lvlOverride w:ilvl="0">
       <w:startOverride w:val="1"/>
     </w:lvlOverride>
@@ -5134,7 +5111,7 @@
     <w:autoRedefine/>
     <w:uiPriority w:val="39"/>
     <w:unhideWhenUsed/>
-    <w:rsid w:val="00C304A3"/>
+    <w:rsid w:val="00BD273C"/>
     <w:pPr>
       <w:spacing w:after="100"/>
     </w:pPr>
@@ -5146,7 +5123,7 @@
     <w:autoRedefine/>
     <w:uiPriority w:val="39"/>
     <w:unhideWhenUsed/>
-    <w:rsid w:val="00C304A3"/>
+    <w:rsid w:val="00BD273C"/>
     <w:pPr>
       <w:spacing w:after="100"/>
       <w:ind w:left="220"/>

</xml_diff>

<commit_message>
Entrega 1: informe mas breve, bibliografia minima
Co-Authored-By: Claude Fable 5.1 <noreply@anthropic.com>
</commit_message>
<xml_diff>
--- a/entregas/Entrega1_RAFFO.docx
+++ b/entregas/Entrega1_RAFFO.docx
@@ -12,7 +12,7 @@
           <w:noProof/>
         </w:rPr>
         <w:drawing>
-          <wp:inline distT="0" distB="0" distL="0" distR="0" wp14:anchorId="5F214EB3" wp14:editId="1BD50A70">
+          <wp:inline distT="0" distB="0" distL="0" distR="0" wp14:anchorId="2B37AC2B" wp14:editId="11D4A898">
             <wp:extent cx="1466850" cy="314325"/>
             <wp:effectExtent l="0" t="0" r="0" b="0"/>
             <wp:docPr id="1" name="Imagen 1"/>
@@ -258,7 +258,7 @@
         <w:jc w:val="both"/>
       </w:pPr>
       <w:r>
-        <w:t>El presente informe corresponde a la primera entrega del trabajo final: la preparación de los datos para un modelo que anticipe la renuncia voluntaria de empleados. Se utiliza el dataset asignado por la cátedra, IBM HR Analytics Employee Attrition &amp; Performance, con 1.470 empleados y 35 variables, en el que solo el 16 % de los empleados renuncia.</w:t>
+        <w:t>El presente informe corresponde a la primera entrega del trabajo final: la preparación de los datos para un modelo que anticipe la renuncia voluntaria de empleados. Se utiliza el dataset IBM HR Analytics Employee Attrition &amp; Performance (Kaggle), con 1.470 empleados y 35 variables, en el que solo el 16 % de los empleados renuncia.</w:t>
       </w:r>
     </w:p>
     <w:p>
@@ -306,7 +306,7 @@
     <w:sdt>
       <w:sdtPr>
         <w:alias w:val="Índice"/>
-        <w:id w:val="-827047268"/>
+        <w:id w:val="-1614273408"/>
       </w:sdtPr>
       <w:sdtEndPr/>
       <w:sdtContent>
@@ -334,7 +334,7 @@
           <w:r>
             <w:fldChar w:fldCharType="separate"/>
           </w:r>
-          <w:hyperlink w:anchor="_Toc240400502" w:history="1">
+          <w:hyperlink w:anchor="_Toc240449860" w:history="1">
             <w:r>
               <w:rPr>
                 <w:rStyle w:val="Hipervnculo"/>
@@ -358,7 +358,7 @@
               <w:rPr>
                 <w:noProof/>
               </w:rPr>
-              <w:instrText xml:space="preserve"> PAGEREF _Toc240400502 \h </w:instrText>
+              <w:instrText xml:space="preserve"> PAGEREF _Toc240449860 \h </w:instrText>
             </w:r>
             <w:r>
               <w:rPr>
@@ -400,7 +400,7 @@
               <w14:ligatures w14:val="standardContextual"/>
             </w:rPr>
           </w:pPr>
-          <w:hyperlink w:anchor="_Toc240400503" w:history="1">
+          <w:hyperlink w:anchor="_Toc240449861" w:history="1">
             <w:r>
               <w:rPr>
                 <w:rStyle w:val="Hipervnculo"/>
@@ -424,7 +424,7 @@
               <w:rPr>
                 <w:noProof/>
               </w:rPr>
-              <w:instrText xml:space="preserve"> PAGEREF _Toc240400503 \h </w:instrText>
+              <w:instrText xml:space="preserve"> PAGEREF _Toc240449861 \h </w:instrText>
             </w:r>
             <w:r>
               <w:rPr>
@@ -466,7 +466,7 @@
               <w14:ligatures w14:val="standardContextual"/>
             </w:rPr>
           </w:pPr>
-          <w:hyperlink w:anchor="_Toc240400504" w:history="1">
+          <w:hyperlink w:anchor="_Toc240449862" w:history="1">
             <w:r>
               <w:rPr>
                 <w:rStyle w:val="Hipervnculo"/>
@@ -490,7 +490,7 @@
               <w:rPr>
                 <w:noProof/>
               </w:rPr>
-              <w:instrText xml:space="preserve"> PAGEREF _Toc240400504 \h </w:instrText>
+              <w:instrText xml:space="preserve"> PAGEREF _Toc240449862 \h </w:instrText>
             </w:r>
             <w:r>
               <w:rPr>
@@ -532,7 +532,7 @@
               <w14:ligatures w14:val="standardContextual"/>
             </w:rPr>
           </w:pPr>
-          <w:hyperlink w:anchor="_Toc240400505" w:history="1">
+          <w:hyperlink w:anchor="_Toc240449863" w:history="1">
             <w:r>
               <w:rPr>
                 <w:rStyle w:val="Hipervnculo"/>
@@ -556,7 +556,7 @@
               <w:rPr>
                 <w:noProof/>
               </w:rPr>
-              <w:instrText xml:space="preserve"> PAGEREF _Toc240400505 \h </w:instrText>
+              <w:instrText xml:space="preserve"> PAGEREF _Toc240449863 \h </w:instrText>
             </w:r>
             <w:r>
               <w:rPr>
@@ -573,7 +573,7 @@
               <w:rPr>
                 <w:noProof/>
               </w:rPr>
-              <w:t>5</w:t>
+              <w:t>4</w:t>
             </w:r>
             <w:r>
               <w:rPr>
@@ -598,7 +598,7 @@
               <w14:ligatures w14:val="standardContextual"/>
             </w:rPr>
           </w:pPr>
-          <w:hyperlink w:anchor="_Toc240400506" w:history="1">
+          <w:hyperlink w:anchor="_Toc240449864" w:history="1">
             <w:r>
               <w:rPr>
                 <w:rStyle w:val="Hipervnculo"/>
@@ -622,7 +622,7 @@
               <w:rPr>
                 <w:noProof/>
               </w:rPr>
-              <w:instrText xml:space="preserve"> PAGEREF _Toc240400506 \h </w:instrText>
+              <w:instrText xml:space="preserve"> PAGEREF _Toc240449864 \h </w:instrText>
             </w:r>
             <w:r>
               <w:rPr>
@@ -664,7 +664,7 @@
               <w14:ligatures w14:val="standardContextual"/>
             </w:rPr>
           </w:pPr>
-          <w:hyperlink w:anchor="_Toc240400507" w:history="1">
+          <w:hyperlink w:anchor="_Toc240449865" w:history="1">
             <w:r>
               <w:rPr>
                 <w:rStyle w:val="Hipervnculo"/>
@@ -688,7 +688,7 @@
               <w:rPr>
                 <w:noProof/>
               </w:rPr>
-              <w:instrText xml:space="preserve"> PAGEREF _Toc240400507 \h </w:instrText>
+              <w:instrText xml:space="preserve"> PAGEREF _Toc240449865 \h </w:instrText>
             </w:r>
             <w:r>
               <w:rPr>
@@ -730,7 +730,7 @@
               <w14:ligatures w14:val="standardContextual"/>
             </w:rPr>
           </w:pPr>
-          <w:hyperlink w:anchor="_Toc240400508" w:history="1">
+          <w:hyperlink w:anchor="_Toc240449866" w:history="1">
             <w:r>
               <w:rPr>
                 <w:rStyle w:val="Hipervnculo"/>
@@ -754,7 +754,7 @@
               <w:rPr>
                 <w:noProof/>
               </w:rPr>
-              <w:instrText xml:space="preserve"> PAGEREF _Toc240400508 \h </w:instrText>
+              <w:instrText xml:space="preserve"> PAGEREF _Toc240449866 \h </w:instrText>
             </w:r>
             <w:r>
               <w:rPr>
@@ -796,7 +796,7 @@
               <w14:ligatures w14:val="standardContextual"/>
             </w:rPr>
           </w:pPr>
-          <w:hyperlink w:anchor="_Toc240400509" w:history="1">
+          <w:hyperlink w:anchor="_Toc240449867" w:history="1">
             <w:r>
               <w:rPr>
                 <w:rStyle w:val="Hipervnculo"/>
@@ -820,7 +820,7 @@
               <w:rPr>
                 <w:noProof/>
               </w:rPr>
-              <w:instrText xml:space="preserve"> PAGEREF _Toc240400509 \h </w:instrText>
+              <w:instrText xml:space="preserve"> PAGEREF _Toc240449867 \h </w:instrText>
             </w:r>
             <w:r>
               <w:rPr>
@@ -862,7 +862,7 @@
               <w14:ligatures w14:val="standardContextual"/>
             </w:rPr>
           </w:pPr>
-          <w:hyperlink w:anchor="_Toc240400510" w:history="1">
+          <w:hyperlink w:anchor="_Toc240449868" w:history="1">
             <w:r>
               <w:rPr>
                 <w:rStyle w:val="Hipervnculo"/>
@@ -886,7 +886,7 @@
               <w:rPr>
                 <w:noProof/>
               </w:rPr>
-              <w:instrText xml:space="preserve"> PAGEREF _Toc240400510 \h </w:instrText>
+              <w:instrText xml:space="preserve"> PAGEREF _Toc240449868 \h </w:instrText>
             </w:r>
             <w:r>
               <w:rPr>
@@ -928,7 +928,7 @@
               <w14:ligatures w14:val="standardContextual"/>
             </w:rPr>
           </w:pPr>
-          <w:hyperlink w:anchor="_Toc240400511" w:history="1">
+          <w:hyperlink w:anchor="_Toc240449869" w:history="1">
             <w:r>
               <w:rPr>
                 <w:rStyle w:val="Hipervnculo"/>
@@ -952,7 +952,7 @@
               <w:rPr>
                 <w:noProof/>
               </w:rPr>
-              <w:instrText xml:space="preserve"> PAGEREF _Toc240400511 \h </w:instrText>
+              <w:instrText xml:space="preserve"> PAGEREF _Toc240449869 \h </w:instrText>
             </w:r>
             <w:r>
               <w:rPr>
@@ -994,7 +994,7 @@
               <w14:ligatures w14:val="standardContextual"/>
             </w:rPr>
           </w:pPr>
-          <w:hyperlink w:anchor="_Toc240400512" w:history="1">
+          <w:hyperlink w:anchor="_Toc240449870" w:history="1">
             <w:r>
               <w:rPr>
                 <w:rStyle w:val="Hipervnculo"/>
@@ -1018,7 +1018,7 @@
               <w:rPr>
                 <w:noProof/>
               </w:rPr>
-              <w:instrText xml:space="preserve"> PAGEREF _Toc240400512 \h </w:instrText>
+              <w:instrText xml:space="preserve"> PAGEREF _Toc240449870 \h </w:instrText>
             </w:r>
             <w:r>
               <w:rPr>
@@ -1060,7 +1060,7 @@
               <w14:ligatures w14:val="standardContextual"/>
             </w:rPr>
           </w:pPr>
-          <w:hyperlink w:anchor="_Toc240400513" w:history="1">
+          <w:hyperlink w:anchor="_Toc240449871" w:history="1">
             <w:r>
               <w:rPr>
                 <w:rStyle w:val="Hipervnculo"/>
@@ -1084,7 +1084,7 @@
               <w:rPr>
                 <w:noProof/>
               </w:rPr>
-              <w:instrText xml:space="preserve"> PAGEREF _Toc240400513 \h </w:instrText>
+              <w:instrText xml:space="preserve"> PAGEREF _Toc240449871 \h </w:instrText>
             </w:r>
             <w:r>
               <w:rPr>
@@ -1126,7 +1126,7 @@
               <w14:ligatures w14:val="standardContextual"/>
             </w:rPr>
           </w:pPr>
-          <w:hyperlink w:anchor="_Toc240400514" w:history="1">
+          <w:hyperlink w:anchor="_Toc240449872" w:history="1">
             <w:r>
               <w:rPr>
                 <w:rStyle w:val="Hipervnculo"/>
@@ -1150,7 +1150,7 @@
               <w:rPr>
                 <w:noProof/>
               </w:rPr>
-              <w:instrText xml:space="preserve"> PAGEREF _Toc240400514 \h </w:instrText>
+              <w:instrText xml:space="preserve"> PAGEREF _Toc240449872 \h </w:instrText>
             </w:r>
             <w:r>
               <w:rPr>
@@ -1192,7 +1192,7 @@
               <w14:ligatures w14:val="standardContextual"/>
             </w:rPr>
           </w:pPr>
-          <w:hyperlink w:anchor="_Toc240400515" w:history="1">
+          <w:hyperlink w:anchor="_Toc240449873" w:history="1">
             <w:r>
               <w:rPr>
                 <w:rStyle w:val="Hipervnculo"/>
@@ -1216,7 +1216,7 @@
               <w:rPr>
                 <w:noProof/>
               </w:rPr>
-              <w:instrText xml:space="preserve"> PAGEREF _Toc240400515 \h </w:instrText>
+              <w:instrText xml:space="preserve"> PAGEREF _Toc240449873 \h </w:instrText>
             </w:r>
             <w:r>
               <w:rPr>
@@ -1258,7 +1258,7 @@
               <w14:ligatures w14:val="standardContextual"/>
             </w:rPr>
           </w:pPr>
-          <w:hyperlink w:anchor="_Toc240400516" w:history="1">
+          <w:hyperlink w:anchor="_Toc240449874" w:history="1">
             <w:r>
               <w:rPr>
                 <w:rStyle w:val="Hipervnculo"/>
@@ -1282,7 +1282,7 @@
               <w:rPr>
                 <w:noProof/>
               </w:rPr>
-              <w:instrText xml:space="preserve"> PAGEREF _Toc240400516 \h </w:instrText>
+              <w:instrText xml:space="preserve"> PAGEREF _Toc240449874 \h </w:instrText>
             </w:r>
             <w:r>
               <w:rPr>
@@ -1324,7 +1324,7 @@
               <w14:ligatures w14:val="standardContextual"/>
             </w:rPr>
           </w:pPr>
-          <w:hyperlink w:anchor="_Toc240400517" w:history="1">
+          <w:hyperlink w:anchor="_Toc240449875" w:history="1">
             <w:r>
               <w:rPr>
                 <w:rStyle w:val="Hipervnculo"/>
@@ -1348,7 +1348,7 @@
               <w:rPr>
                 <w:noProof/>
               </w:rPr>
-              <w:instrText xml:space="preserve"> PAGEREF _Toc240400517 \h </w:instrText>
+              <w:instrText xml:space="preserve"> PAGEREF _Toc240449875 \h </w:instrText>
             </w:r>
             <w:r>
               <w:rPr>
@@ -1390,7 +1390,7 @@
               <w14:ligatures w14:val="standardContextual"/>
             </w:rPr>
           </w:pPr>
-          <w:hyperlink w:anchor="_Toc240400518" w:history="1">
+          <w:hyperlink w:anchor="_Toc240449876" w:history="1">
             <w:r>
               <w:rPr>
                 <w:rStyle w:val="Hipervnculo"/>
@@ -1414,7 +1414,7 @@
               <w:rPr>
                 <w:noProof/>
               </w:rPr>
-              <w:instrText xml:space="preserve"> PAGEREF _Toc240400518 \h </w:instrText>
+              <w:instrText xml:space="preserve"> PAGEREF _Toc240449876 \h </w:instrText>
             </w:r>
             <w:r>
               <w:rPr>
@@ -1456,7 +1456,7 @@
               <w14:ligatures w14:val="standardContextual"/>
             </w:rPr>
           </w:pPr>
-          <w:hyperlink w:anchor="_Toc240400519" w:history="1">
+          <w:hyperlink w:anchor="_Toc240449877" w:history="1">
             <w:r>
               <w:rPr>
                 <w:rStyle w:val="Hipervnculo"/>
@@ -1480,7 +1480,7 @@
               <w:rPr>
                 <w:noProof/>
               </w:rPr>
-              <w:instrText xml:space="preserve"> PAGEREF _Toc240400519 \h </w:instrText>
+              <w:instrText xml:space="preserve"> PAGEREF _Toc240449877 \h </w:instrText>
             </w:r>
             <w:r>
               <w:rPr>
@@ -1497,7 +1497,7 @@
               <w:rPr>
                 <w:noProof/>
               </w:rPr>
-              <w:t>11</w:t>
+              <w:t>10</w:t>
             </w:r>
             <w:r>
               <w:rPr>
@@ -1523,7 +1523,7 @@
       <w:pPr>
         <w:pStyle w:val="Ttulo1"/>
       </w:pPr>
-      <w:bookmarkStart w:id="0" w:name="_Toc240400502"/>
+      <w:bookmarkStart w:id="0" w:name="_Toc240449860"/>
       <w:r>
         <w:t>1. INTRODUCCIÓN</w:t>
       </w:r>
@@ -1553,14 +1553,14 @@
         <w:jc w:val="both"/>
       </w:pPr>
       <w:r>
-        <w:t>El dataset es el asignado por la cátedra en la clase 7: IBM HR Analytics Employee Attrition &amp; Performance, publicado en Kaggle. Contiene 1.470 empleados y 35 columnas con datos demográficos, del puesto, de compensación, de satisfacción y de trayectoria laboral. Es un conjunto ficticio creado por científicos de datos de IBM, por lo que no contiene datos personales reales.</w:t>
+        <w:t>El dataset es IBM HR Analytics Employee Attrition &amp; Performance, publicado en Kaggle: 1.470 empleados y 35 columnas con datos demográficos, del puesto, de compensación, de satisfacción y de trayectoria laboral.</w:t>
       </w:r>
     </w:p>
     <w:p>
       <w:pPr>
         <w:pStyle w:val="Ttulo1"/>
       </w:pPr>
-      <w:bookmarkStart w:id="1" w:name="_Toc240400503"/>
+      <w:bookmarkStart w:id="1" w:name="_Toc240449861"/>
       <w:r>
         <w:t>2. LOS DATOS</w:t>
       </w:r>
@@ -1570,7 +1570,7 @@
       <w:pPr>
         <w:pStyle w:val="Ttulo2"/>
       </w:pPr>
-      <w:bookmarkStart w:id="2" w:name="_Toc240400504"/>
+      <w:bookmarkStart w:id="2" w:name="_Toc240449862"/>
       <w:r>
         <w:t>2.1 Descripción de las variables</w:t>
       </w:r>
@@ -2265,7 +2265,7 @@
       <w:pPr>
         <w:pStyle w:val="Ttulo2"/>
       </w:pPr>
-      <w:bookmarkStart w:id="3" w:name="_Toc240400505"/>
+      <w:bookmarkStart w:id="3" w:name="_Toc240449863"/>
       <w:r>
         <w:t>2.2 Calidad de los datos</w:t>
       </w:r>
@@ -2304,10 +2304,10 @@
           <w:noProof/>
         </w:rPr>
         <w:drawing>
-          <wp:inline distT="0" distB="0" distL="0" distR="0" wp14:anchorId="56FE2342" wp14:editId="6E9B7A22">
+          <wp:inline distT="0" distB="0" distL="0" distR="0" wp14:anchorId="265480D3" wp14:editId="12DEDB92">
             <wp:extent cx="5667375" cy="2038350"/>
             <wp:effectExtent l="0" t="0" r="0" b="0"/>
-            <wp:docPr id="1967028203" name="Imagen 1967028203"/>
+            <wp:docPr id="1096839477" name="Imagen 1096839477"/>
             <wp:cNvGraphicFramePr>
               <a:graphicFrameLocks xmlns:a="http://schemas.openxmlformats.org/drawingml/2006/main" noChangeAspect="1"/>
             </wp:cNvGraphicFramePr>
@@ -2362,7 +2362,7 @@
       <w:pPr>
         <w:pStyle w:val="Ttulo1"/>
       </w:pPr>
-      <w:bookmarkStart w:id="4" w:name="_Toc240400506"/>
+      <w:bookmarkStart w:id="4" w:name="_Toc240449864"/>
       <w:r>
         <w:t>3. ANÁLISIS EXPLORATORIO DE LOS DATOS</w:t>
       </w:r>
@@ -2401,10 +2401,10 @@
           <w:noProof/>
         </w:rPr>
         <w:drawing>
-          <wp:inline distT="0" distB="0" distL="0" distR="0" wp14:anchorId="5DA95E6A" wp14:editId="4597F049">
+          <wp:inline distT="0" distB="0" distL="0" distR="0" wp14:anchorId="0A9A3D5E" wp14:editId="5A310402">
             <wp:extent cx="4933950" cy="3505200"/>
             <wp:effectExtent l="0" t="0" r="0" b="0"/>
-            <wp:docPr id="405625498" name="Imagen 405625498"/>
+            <wp:docPr id="1121393429" name="Imagen 1121393429"/>
             <wp:cNvGraphicFramePr>
               <a:graphicFrameLocks xmlns:a="http://schemas.openxmlformats.org/drawingml/2006/main" noChangeAspect="1"/>
             </wp:cNvGraphicFramePr>
@@ -2531,10 +2531,10 @@
           <w:noProof/>
         </w:rPr>
         <w:drawing>
-          <wp:inline distT="0" distB="0" distL="0" distR="0" wp14:anchorId="70E9E9F2" wp14:editId="58C0E96A">
+          <wp:inline distT="0" distB="0" distL="0" distR="0" wp14:anchorId="257397CC" wp14:editId="5E932322">
             <wp:extent cx="5124450" cy="4572000"/>
             <wp:effectExtent l="0" t="0" r="0" b="0"/>
-            <wp:docPr id="1780297659" name="Imagen 1780297659"/>
+            <wp:docPr id="1494429758" name="Imagen 1494429758"/>
             <wp:cNvGraphicFramePr>
               <a:graphicFrameLocks xmlns:a="http://schemas.openxmlformats.org/drawingml/2006/main" noChangeAspect="1"/>
             </wp:cNvGraphicFramePr>
@@ -2637,7 +2637,7 @@
       <w:pPr>
         <w:pStyle w:val="Ttulo1"/>
       </w:pPr>
-      <w:bookmarkStart w:id="5" w:name="_Toc240400507"/>
+      <w:bookmarkStart w:id="5" w:name="_Toc240449865"/>
       <w:r>
         <w:t>4. PREPARACIÓN DE LOS DATOS</w:t>
       </w:r>
@@ -2647,7 +2647,7 @@
       <w:pPr>
         <w:pStyle w:val="Ttulo2"/>
       </w:pPr>
-      <w:bookmarkStart w:id="6" w:name="_Toc240400508"/>
+      <w:bookmarkStart w:id="6" w:name="_Toc240449866"/>
       <w:r>
         <w:t>4.1 Columnas eliminadas y baja varianza</w:t>
       </w:r>
@@ -2678,7 +2678,7 @@
       <w:pPr>
         <w:pStyle w:val="Ttulo2"/>
       </w:pPr>
-      <w:bookmarkStart w:id="7" w:name="_Toc240400509"/>
+      <w:bookmarkStart w:id="7" w:name="_Toc240449867"/>
       <w:r>
         <w:t>4.2 Tipos de variables y su tratamiento</w:t>
       </w:r>
@@ -2706,7 +2706,7 @@
       <w:pPr>
         <w:pStyle w:val="Ttulo2"/>
       </w:pPr>
-      <w:bookmarkStart w:id="8" w:name="_Toc240400510"/>
+      <w:bookmarkStart w:id="8" w:name="_Toc240449868"/>
       <w:r>
         <w:t>4.3 Grupo de examen y data leakage</w:t>
       </w:r>
@@ -2728,7 +2728,7 @@
       <w:pPr>
         <w:pStyle w:val="Ttulo2"/>
       </w:pPr>
-      <w:bookmarkStart w:id="9" w:name="_Toc240400511"/>
+      <w:bookmarkStart w:id="9" w:name="_Toc240449869"/>
       <w:r>
         <w:t>4.4 Pipeline de preprocesamiento</w:t>
       </w:r>
@@ -2750,7 +2750,7 @@
       <w:pPr>
         <w:pStyle w:val="Ttulo2"/>
       </w:pPr>
-      <w:bookmarkStart w:id="10" w:name="_Toc240400512"/>
+      <w:bookmarkStart w:id="10" w:name="_Toc240449870"/>
       <w:r>
         <w:t>4.5 Balance de clases</w:t>
       </w:r>
@@ -2772,7 +2772,7 @@
       <w:pPr>
         <w:pStyle w:val="Ttulo2"/>
       </w:pPr>
-      <w:bookmarkStart w:id="11" w:name="_Toc240400513"/>
+      <w:bookmarkStart w:id="11" w:name="_Toc240449871"/>
       <w:r>
         <w:t>4.6 Transformaciones y componentes principales</w:t>
       </w:r>
@@ -2820,10 +2820,10 @@
           <w:noProof/>
         </w:rPr>
         <w:drawing>
-          <wp:inline distT="0" distB="0" distL="0" distR="0" wp14:anchorId="7BC77520" wp14:editId="2DE542DD">
+          <wp:inline distT="0" distB="0" distL="0" distR="0" wp14:anchorId="4DB7A7C4" wp14:editId="19ABF0EF">
             <wp:extent cx="4933950" cy="2657475"/>
             <wp:effectExtent l="0" t="0" r="0" b="0"/>
-            <wp:docPr id="2043873994" name="Imagen 2043873994"/>
+            <wp:docPr id="1473097034" name="Imagen 1473097034"/>
             <wp:cNvGraphicFramePr>
               <a:graphicFrameLocks xmlns:a="http://schemas.openxmlformats.org/drawingml/2006/main" noChangeAspect="1"/>
             </wp:cNvGraphicFramePr>
@@ -2878,7 +2878,7 @@
       <w:pPr>
         <w:pStyle w:val="Ttulo2"/>
       </w:pPr>
-      <w:bookmarkStart w:id="12" w:name="_Toc240400514"/>
+      <w:bookmarkStart w:id="12" w:name="_Toc240449872"/>
       <w:r>
         <w:t>4.7 Ranking de variables</w:t>
       </w:r>
@@ -2890,7 +2890,10 @@
         <w:jc w:val="both"/>
       </w:pPr>
       <w:r>
-        <w:t>Antes de entrenar ningún modelo se calculó la información mutua de cada columna con la renuncia, únicamente sobre el grupo de entrenamiento (Gráfico 5). Encabezan el ranking el ingreso mensual, los años totales de carrera, el nivel de opciones sobre acciones y las horas extra, seguidos por la cantidad de empresas previas, los años en el rol actual y la edad. El ranking es una guía para entender los datos, no una selección: el modelo de la Entrega 2 recibe todas las variables.</w:t>
+        <w:t>Antes de entrenar ningún modelo se midió, para cada variable, cuánto ayuda conocerla para anticipar si un empleado renuncia (información mutua), únicamente sobre el grupo de entrenamiento (Gráfico 5). Encabezan el ranking el ingreso mensual, los años totales de carrera, el nivel de opciones sobre acciones y las horas extra, seguidos por la cantidad de empresas previas, los años en el rol actual y la edad. El ranking es una guía para entender los datos, no una selección: el modelo de la Entrega 2 recibe toda</w:t>
+      </w:r>
+      <w:r>
+        <w:t>s las variables.</w:t>
       </w:r>
     </w:p>
     <w:p>
@@ -2917,10 +2920,10 @@
           <w:noProof/>
         </w:rPr>
         <w:drawing>
-          <wp:inline distT="0" distB="0" distL="0" distR="0" wp14:anchorId="4F42E409" wp14:editId="54331F9C">
+          <wp:inline distT="0" distB="0" distL="0" distR="0" wp14:anchorId="7446B56C" wp14:editId="57AADDB4">
             <wp:extent cx="4933950" cy="3009900"/>
             <wp:effectExtent l="0" t="0" r="0" b="0"/>
-            <wp:docPr id="323902291" name="Imagen 323902291"/>
+            <wp:docPr id="1505895859" name="Imagen 1505895859"/>
             <wp:cNvGraphicFramePr>
               <a:graphicFrameLocks xmlns:a="http://schemas.openxmlformats.org/drawingml/2006/main" noChangeAspect="1"/>
             </wp:cNvGraphicFramePr>
@@ -2975,7 +2978,7 @@
       <w:pPr>
         <w:pStyle w:val="Ttulo2"/>
       </w:pPr>
-      <w:bookmarkStart w:id="13" w:name="_Toc240400515"/>
+      <w:bookmarkStart w:id="13" w:name="_Toc240449873"/>
       <w:r>
         <w:t>4.8 Dataset final</w:t>
       </w:r>
@@ -2994,7 +2997,7 @@
       <w:pPr>
         <w:pStyle w:val="Ttulo1"/>
       </w:pPr>
-      <w:bookmarkStart w:id="14" w:name="_Toc240400516"/>
+      <w:bookmarkStart w:id="14" w:name="_Toc240449874"/>
       <w:r>
         <w:t>5. BASELINE</w:t>
       </w:r>
@@ -3006,7 +3009,7 @@
         <w:jc w:val="both"/>
       </w:pPr>
       <w:r>
-        <w:t>Antes de entrenar un modelo se estableció la referencia mínima: un clasificador que predice siempre la clase mayoritaria, "se queda", evaluado por validación cruzada estratificada de cinco particiones dentro del grupo de entrenamiento. El grupo de examen no se utiliza hasta la evaluación final de la Entrega 2.</w:t>
+        <w:t>El baseline es la referencia mínima: qué tan bien se puede predecir sin aprender nada de los datos. Aquí es un clasificador que predice siempre la respuesta más frecuente, "se queda", evaluado por validación cruzada de cinco particiones dentro del grupo de entrenamiento. Cualquier modelo que se entrene después deberá superarlo. El grupo de examen no se utiliza hasta la evaluación final de la Entrega 2.</w:t>
       </w:r>
     </w:p>
     <w:p>
@@ -3358,7 +3361,7 @@
       <w:pPr>
         <w:pStyle w:val="Ttulo1"/>
       </w:pPr>
-      <w:bookmarkStart w:id="15" w:name="_Toc240400517"/>
+      <w:bookmarkStart w:id="15" w:name="_Toc240449875"/>
       <w:r>
         <w:t>6. CONCLUSIONES</w:t>
       </w:r>
@@ -4121,7 +4124,7 @@
       <w:pPr>
         <w:pStyle w:val="Ttulo1"/>
       </w:pPr>
-      <w:bookmarkStart w:id="16" w:name="_Toc240400518"/>
+      <w:bookmarkStart w:id="16" w:name="_Toc240449876"/>
       <w:r>
         <w:t>7. LINK COLAB</w:t>
       </w:r>
@@ -4152,18 +4155,9 @@
     </w:p>
     <w:p>
       <w:pPr>
-        <w:spacing w:after="120" w:line="276" w:lineRule="auto"/>
-        <w:jc w:val="both"/>
-      </w:pPr>
-      <w:r>
-        <w:t>Al abrirlo, seleccionar Entorno de ejecución → Ejecutar todas y aceptar el aviso "Ejecutar de todos modos". La primera celda descarga los datos e instala las librerías necesarias; la ejecución completa demora alrededor de un minuto y genera, además de los resultados en pantalla, el reporte Sweetviz y los archivos del dataset final.</w:t>
-      </w:r>
-    </w:p>
-    <w:p>
-      <w:pPr>
         <w:pStyle w:val="Ttulo1"/>
       </w:pPr>
-      <w:bookmarkStart w:id="17" w:name="_Toc240400519"/>
+      <w:bookmarkStart w:id="17" w:name="_Toc240449877"/>
       <w:r>
         <w:t>8. REFERENCIAS</w:t>
       </w:r>
@@ -4179,7 +4173,7 @@
         <w:spacing w:after="60" w:line="276" w:lineRule="auto"/>
       </w:pPr>
       <w:r>
-        <w:t>IBM / Subhash, P. IBM HR Analytics Employee Attrition &amp; Performance [dataset]. Kaggle. https://www.kaggle.com/datasets/pavansubhasht/ibm-hr-analytics-attrition-dataset</w:t>
+        <w:t>IBM HR Analytics Employee Attrition &amp; Performance [dataset]. Kaggle. https://www.kaggle.com/datasets/pavansubhasht/ibm-hr-analytics-attrition-dataset</w:t>
       </w:r>
     </w:p>
     <w:p>
@@ -4192,7 +4186,7 @@
         <w:spacing w:after="60" w:line="276" w:lineRule="auto"/>
       </w:pPr>
       <w:r>
-        <w:t>Pedregosa, F. et al. (2011). Scikit-learn: Machine Learning in Python. Journal of Machine Learning Research, 12, 2825-2830.</w:t>
+        <w:t>Barreto Marcano, A. (2026). Material de las clases 4 a 6 del curso M71V/M72V 02, UBA: preparación de los datos, análisis exploratorio e ingeniería de variables.</w:t>
       </w:r>
     </w:p>
     <w:p>
@@ -4205,46 +4199,7 @@
         <w:spacing w:after="60" w:line="276" w:lineRule="auto"/>
       </w:pPr>
       <w:r>
-        <w:t>McKinney, W. (2010). Data Structures for Statistical Computing in Python. Proceedings of the 9th Python in Science Conference, 51-56.</w:t>
-      </w:r>
-    </w:p>
-    <w:p>
-      <w:pPr>
-        <w:pStyle w:val="Prrafodelista"/>
-        <w:numPr>
-          <w:ilvl w:val="0"/>
-          <w:numId w:val="2"/>
-        </w:numPr>
-        <w:spacing w:after="60" w:line="276" w:lineRule="auto"/>
-      </w:pPr>
-      <w:r>
-        <w:t>Scikit-learn User Guide: Preprocessing data; Cross-validation: evaluating estimator performance. https://scikit-learn.org/stable/user_guide.html</w:t>
-      </w:r>
-    </w:p>
-    <w:p>
-      <w:pPr>
-        <w:pStyle w:val="Prrafodelista"/>
-        <w:numPr>
-          <w:ilvl w:val="0"/>
-          <w:numId w:val="2"/>
-        </w:numPr>
-        <w:spacing w:after="60" w:line="276" w:lineRule="auto"/>
-      </w:pPr>
-      <w:r>
-        <w:t>Bertrand, F. Sweetviz: automated exploratory data analysis. https://github.com/fbdesignpro/sweetviz</w:t>
-      </w:r>
-    </w:p>
-    <w:p>
-      <w:pPr>
-        <w:pStyle w:val="Prrafodelista"/>
-        <w:numPr>
-          <w:ilvl w:val="0"/>
-          <w:numId w:val="2"/>
-        </w:numPr>
-        <w:spacing w:after="60" w:line="276" w:lineRule="auto"/>
-      </w:pPr>
-      <w:r>
-        <w:t>Barreto Marcano, A. (2026). Clases 4 a 6: Preparación de los datos, análisis exploratorio e ingeniería de variables. Material del curso M71V/M72V 02, UBA.</w:t>
+        <w:t>Scikit-learn. Documentación oficial. https://scikit-learn.org/stable/</w:t>
       </w:r>
     </w:p>
     <w:sectPr>
@@ -4345,10 +4300,96 @@
 <file path=word/numbering.xml><?xml version="1.0" encoding="utf-8"?>
 <w:numbering xmlns:wpc="http://schemas.microsoft.com/office/word/2010/wordprocessingCanvas" xmlns:cx="http://schemas.microsoft.com/office/drawing/2014/chartex" xmlns:cx1="http://schemas.microsoft.com/office/drawing/2015/9/8/chartex" xmlns:cx2="http://schemas.microsoft.com/office/drawing/2015/10/21/chartex" xmlns:cx3="http://schemas.microsoft.com/office/drawing/2016/5/9/chartex" xmlns:cx4="http://schemas.microsoft.com/office/drawing/2016/5/10/chartex" xmlns:cx5="http://schemas.microsoft.com/office/drawing/2016/5/11/chartex" xmlns:cx6="http://schemas.microsoft.com/office/drawing/2016/5/12/chartex" xmlns:cx7="http://schemas.microsoft.com/office/drawing/2016/5/13/chartex" xmlns:cx8="http://schemas.microsoft.com/office/drawing/2016/5/14/chartex" xmlns:mc="http://schemas.openxmlformats.org/markup-compatibility/2006" xmlns:aink="http://schemas.microsoft.com/office/drawing/2016/ink" xmlns:am3d="http://schemas.microsoft.com/office/drawing/2017/model3d" xmlns:o="urn:schemas-microsoft-com:office:office" xmlns:oel="http://schemas.microsoft.com/office/2019/extlst" xmlns:r="http://schemas.openxmlformats.org/officeDocument/2006/relationships" xmlns:m="http://schemas.openxmlformats.org/officeDocument/2006/math" xmlns:v="urn:schemas-microsoft-com:vml" xmlns:wp14="http://schemas.microsoft.com/office/word/2010/wordprocessingDrawing" xmlns:wp="http://schemas.openxmlformats.org/drawingml/2006/wordprocessingDrawing" xmlns:w10="urn:schemas-microsoft-com:office:word" xmlns:w="http://schemas.openxmlformats.org/wordprocessingml/2006/main" xmlns:w14="http://schemas.microsoft.com/office/word/2010/wordml" xmlns:w15="http://schemas.microsoft.com/office/word/2012/wordml" xmlns:w16cex="http://schemas.microsoft.com/office/word/2018/wordml/cex" xmlns:w16cid="http://schemas.microsoft.com/office/word/2016/wordml/cid" xmlns:w16="http://schemas.microsoft.com/office/word/2018/wordml" xmlns:w16du="http://schemas.microsoft.com/office/word/2023/wordml/word16du" xmlns:w16sdtdh="http://schemas.microsoft.com/office/word/2020/wordml/sdtdatahash" xmlns:w16sdtfl="http://schemas.microsoft.com/office/word/2024/wordml/sdtformatlock" xmlns:w16se="http://schemas.microsoft.com/office/word/2015/wordml/symex" xmlns:wpg="http://schemas.microsoft.com/office/word/2010/wordprocessingGroup" xmlns:wpi="http://schemas.microsoft.com/office/word/2010/wordprocessingInk" xmlns:wne="http://schemas.microsoft.com/office/word/2006/wordml" xmlns:wps="http://schemas.microsoft.com/office/word/2010/wordprocessingShape" mc:Ignorable="w14 w15 w16se w16cid w16 w16cex w16sdtdh w16sdtfl w16du wp14">
   <w:abstractNum w:abstractNumId="0" w15:restartNumberingAfterBreak="0">
-    <w:nsid w:val="1FB4644B"/>
+    <w:nsid w:val="417C721C"/>
     <w:multiLevelType w:val="hybridMultilevel"/>
-    <w:tmpl w:val="99582B86"/>
-    <w:lvl w:ilvl="0" w:tplc="3E1062A8">
+    <w:tmpl w:val="DF78B1C4"/>
+    <w:lvl w:ilvl="0" w:tplc="2C7E391A">
+      <w:start w:val="1"/>
+      <w:numFmt w:val="bullet"/>
+      <w:lvlText w:val="●"/>
+      <w:lvlJc w:val="left"/>
+      <w:pPr>
+        <w:ind w:left="720" w:hanging="360"/>
+      </w:pPr>
+    </w:lvl>
+    <w:lvl w:ilvl="1" w:tplc="E1B8D16A">
+      <w:start w:val="1"/>
+      <w:numFmt w:val="bullet"/>
+      <w:lvlText w:val="○"/>
+      <w:lvlJc w:val="left"/>
+      <w:pPr>
+        <w:ind w:left="1440" w:hanging="360"/>
+      </w:pPr>
+    </w:lvl>
+    <w:lvl w:ilvl="2" w:tplc="731C7512">
+      <w:start w:val="1"/>
+      <w:numFmt w:val="bullet"/>
+      <w:lvlText w:val="■"/>
+      <w:lvlJc w:val="left"/>
+      <w:pPr>
+        <w:ind w:left="2160" w:hanging="360"/>
+      </w:pPr>
+    </w:lvl>
+    <w:lvl w:ilvl="3" w:tplc="8F682626">
+      <w:start w:val="1"/>
+      <w:numFmt w:val="bullet"/>
+      <w:lvlText w:val="●"/>
+      <w:lvlJc w:val="left"/>
+      <w:pPr>
+        <w:ind w:left="2880" w:hanging="360"/>
+      </w:pPr>
+    </w:lvl>
+    <w:lvl w:ilvl="4" w:tplc="E246565C">
+      <w:start w:val="1"/>
+      <w:numFmt w:val="bullet"/>
+      <w:lvlText w:val="○"/>
+      <w:lvlJc w:val="left"/>
+      <w:pPr>
+        <w:ind w:left="3600" w:hanging="360"/>
+      </w:pPr>
+    </w:lvl>
+    <w:lvl w:ilvl="5" w:tplc="927AC19A">
+      <w:start w:val="1"/>
+      <w:numFmt w:val="bullet"/>
+      <w:lvlText w:val="■"/>
+      <w:lvlJc w:val="left"/>
+      <w:pPr>
+        <w:ind w:left="4320" w:hanging="360"/>
+      </w:pPr>
+    </w:lvl>
+    <w:lvl w:ilvl="6" w:tplc="A8846286">
+      <w:start w:val="1"/>
+      <w:numFmt w:val="bullet"/>
+      <w:lvlText w:val="●"/>
+      <w:lvlJc w:val="left"/>
+      <w:pPr>
+        <w:ind w:left="5040" w:hanging="360"/>
+      </w:pPr>
+    </w:lvl>
+    <w:lvl w:ilvl="7" w:tplc="06B0DE76">
+      <w:start w:val="1"/>
+      <w:numFmt w:val="bullet"/>
+      <w:lvlText w:val="●"/>
+      <w:lvlJc w:val="left"/>
+      <w:pPr>
+        <w:ind w:left="5760" w:hanging="360"/>
+      </w:pPr>
+    </w:lvl>
+    <w:lvl w:ilvl="8" w:tplc="0D4A2B94">
+      <w:start w:val="1"/>
+      <w:numFmt w:val="bullet"/>
+      <w:lvlText w:val="●"/>
+      <w:lvlJc w:val="left"/>
+      <w:pPr>
+        <w:ind w:left="6480" w:hanging="360"/>
+      </w:pPr>
+    </w:lvl>
+  </w:abstractNum>
+  <w:abstractNum w:abstractNumId="1" w15:restartNumberingAfterBreak="0">
+    <w:nsid w:val="4ECF14C7"/>
+    <w:multiLevelType w:val="hybridMultilevel"/>
+    <w:tmpl w:val="8C786F16"/>
+    <w:lvl w:ilvl="0" w:tplc="08CE0BAA">
       <w:start w:val="1"/>
       <w:numFmt w:val="bullet"/>
       <w:lvlText w:val="•"/>
@@ -4357,141 +4398,55 @@
         <w:ind w:left="720" w:hanging="360"/>
       </w:pPr>
     </w:lvl>
-    <w:lvl w:ilvl="1" w:tplc="23061B2E">
+    <w:lvl w:ilvl="1" w:tplc="D88E3C8C">
       <w:numFmt w:val="decimal"/>
       <w:lvlText w:val=""/>
       <w:lvlJc w:val="left"/>
     </w:lvl>
-    <w:lvl w:ilvl="2" w:tplc="39D634AC">
+    <w:lvl w:ilvl="2" w:tplc="3704198A">
       <w:numFmt w:val="decimal"/>
       <w:lvlText w:val=""/>
       <w:lvlJc w:val="left"/>
     </w:lvl>
-    <w:lvl w:ilvl="3" w:tplc="22B6E2B4">
+    <w:lvl w:ilvl="3" w:tplc="43405EAA">
       <w:numFmt w:val="decimal"/>
       <w:lvlText w:val=""/>
       <w:lvlJc w:val="left"/>
     </w:lvl>
-    <w:lvl w:ilvl="4" w:tplc="A0601A3C">
+    <w:lvl w:ilvl="4" w:tplc="2062AAB4">
       <w:numFmt w:val="decimal"/>
       <w:lvlText w:val=""/>
       <w:lvlJc w:val="left"/>
     </w:lvl>
-    <w:lvl w:ilvl="5" w:tplc="F3129FBA">
+    <w:lvl w:ilvl="5" w:tplc="3F10B300">
       <w:numFmt w:val="decimal"/>
       <w:lvlText w:val=""/>
       <w:lvlJc w:val="left"/>
     </w:lvl>
-    <w:lvl w:ilvl="6" w:tplc="18B41310">
+    <w:lvl w:ilvl="6" w:tplc="9F922B9C">
       <w:numFmt w:val="decimal"/>
       <w:lvlText w:val=""/>
       <w:lvlJc w:val="left"/>
     </w:lvl>
-    <w:lvl w:ilvl="7" w:tplc="8C82D212">
+    <w:lvl w:ilvl="7" w:tplc="4F7CC958">
       <w:numFmt w:val="decimal"/>
       <w:lvlText w:val=""/>
       <w:lvlJc w:val="left"/>
     </w:lvl>
-    <w:lvl w:ilvl="8" w:tplc="82BE2E68">
+    <w:lvl w:ilvl="8" w:tplc="D80C06F6">
       <w:numFmt w:val="decimal"/>
       <w:lvlText w:val=""/>
       <w:lvlJc w:val="left"/>
     </w:lvl>
   </w:abstractNum>
-  <w:abstractNum w:abstractNumId="1" w15:restartNumberingAfterBreak="0">
-    <w:nsid w:val="77596BEC"/>
-    <w:multiLevelType w:val="hybridMultilevel"/>
-    <w:tmpl w:val="C82E3CB0"/>
-    <w:lvl w:ilvl="0" w:tplc="A5F8A256">
-      <w:start w:val="1"/>
-      <w:numFmt w:val="bullet"/>
-      <w:lvlText w:val="●"/>
-      <w:lvlJc w:val="left"/>
-      <w:pPr>
-        <w:ind w:left="720" w:hanging="360"/>
-      </w:pPr>
-    </w:lvl>
-    <w:lvl w:ilvl="1" w:tplc="5D74C416">
-      <w:start w:val="1"/>
-      <w:numFmt w:val="bullet"/>
-      <w:lvlText w:val="○"/>
-      <w:lvlJc w:val="left"/>
-      <w:pPr>
-        <w:ind w:left="1440" w:hanging="360"/>
-      </w:pPr>
-    </w:lvl>
-    <w:lvl w:ilvl="2" w:tplc="F3247786">
-      <w:start w:val="1"/>
-      <w:numFmt w:val="bullet"/>
-      <w:lvlText w:val="■"/>
-      <w:lvlJc w:val="left"/>
-      <w:pPr>
-        <w:ind w:left="2160" w:hanging="360"/>
-      </w:pPr>
-    </w:lvl>
-    <w:lvl w:ilvl="3" w:tplc="CEB81960">
-      <w:start w:val="1"/>
-      <w:numFmt w:val="bullet"/>
-      <w:lvlText w:val="●"/>
-      <w:lvlJc w:val="left"/>
-      <w:pPr>
-        <w:ind w:left="2880" w:hanging="360"/>
-      </w:pPr>
-    </w:lvl>
-    <w:lvl w:ilvl="4" w:tplc="BE94B9C8">
-      <w:start w:val="1"/>
-      <w:numFmt w:val="bullet"/>
-      <w:lvlText w:val="○"/>
-      <w:lvlJc w:val="left"/>
-      <w:pPr>
-        <w:ind w:left="3600" w:hanging="360"/>
-      </w:pPr>
-    </w:lvl>
-    <w:lvl w:ilvl="5" w:tplc="B63A5F6E">
-      <w:start w:val="1"/>
-      <w:numFmt w:val="bullet"/>
-      <w:lvlText w:val="■"/>
-      <w:lvlJc w:val="left"/>
-      <w:pPr>
-        <w:ind w:left="4320" w:hanging="360"/>
-      </w:pPr>
-    </w:lvl>
-    <w:lvl w:ilvl="6" w:tplc="6CBE4FBA">
-      <w:start w:val="1"/>
-      <w:numFmt w:val="bullet"/>
-      <w:lvlText w:val="●"/>
-      <w:lvlJc w:val="left"/>
-      <w:pPr>
-        <w:ind w:left="5040" w:hanging="360"/>
-      </w:pPr>
-    </w:lvl>
-    <w:lvl w:ilvl="7" w:tplc="FCEA6678">
-      <w:start w:val="1"/>
-      <w:numFmt w:val="bullet"/>
-      <w:lvlText w:val="●"/>
-      <w:lvlJc w:val="left"/>
-      <w:pPr>
-        <w:ind w:left="5760" w:hanging="360"/>
-      </w:pPr>
-    </w:lvl>
-    <w:lvl w:ilvl="8" w:tplc="7E621392">
-      <w:start w:val="1"/>
-      <w:numFmt w:val="bullet"/>
-      <w:lvlText w:val="●"/>
-      <w:lvlJc w:val="left"/>
-      <w:pPr>
-        <w:ind w:left="6480" w:hanging="360"/>
-      </w:pPr>
-    </w:lvl>
-  </w:abstractNum>
-  <w:num w:numId="1" w16cid:durableId="1360593516">
-    <w:abstractNumId w:val="1"/>
+  <w:num w:numId="1" w16cid:durableId="149951890">
+    <w:abstractNumId w:val="0"/>
     <w:lvlOverride w:ilvl="0">
       <w:startOverride w:val="1"/>
     </w:lvlOverride>
   </w:num>
-  <w:num w:numId="2" w16cid:durableId="1654023311">
-    <w:abstractNumId w:val="0"/>
+  <w:num w:numId="2" w16cid:durableId="938029991">
+    <w:abstractNumId w:val="1"/>
     <w:lvlOverride w:ilvl="0">
       <w:startOverride w:val="1"/>
     </w:lvlOverride>
@@ -5111,7 +5066,7 @@
     <w:autoRedefine/>
     <w:uiPriority w:val="39"/>
     <w:unhideWhenUsed/>
-    <w:rsid w:val="00BD273C"/>
+    <w:rsid w:val="00F47959"/>
     <w:pPr>
       <w:spacing w:after="100"/>
     </w:pPr>
@@ -5123,7 +5078,7 @@
     <w:autoRedefine/>
     <w:uiPriority w:val="39"/>
     <w:unhideWhenUsed/>
-    <w:rsid w:val="00BD273C"/>
+    <w:rsid w:val="00F47959"/>
     <w:pPr>
       <w:spacing w:after="100"/>
       <w:ind w:left="220"/>

</xml_diff>

<commit_message>
Entrega 1: bibliografia en un solo bloque
Co-Authored-By: Claude Fable 5.1 <noreply@anthropic.com>
</commit_message>
<xml_diff>
--- a/entregas/Entrega1_RAFFO.docx
+++ b/entregas/Entrega1_RAFFO.docx
@@ -12,7 +12,7 @@
           <w:noProof/>
         </w:rPr>
         <w:drawing>
-          <wp:inline distT="0" distB="0" distL="0" distR="0" wp14:anchorId="2B37AC2B" wp14:editId="11D4A898">
+          <wp:inline distT="0" distB="0" distL="0" distR="0" wp14:anchorId="3DAD4CB1" wp14:editId="3C64026F">
             <wp:extent cx="1466850" cy="314325"/>
             <wp:effectExtent l="0" t="0" r="0" b="0"/>
             <wp:docPr id="1" name="Imagen 1"/>
@@ -306,7 +306,7 @@
     <w:sdt>
       <w:sdtPr>
         <w:alias w:val="Índice"/>
-        <w:id w:val="-1614273408"/>
+        <w:id w:val="-2105713022"/>
       </w:sdtPr>
       <w:sdtEndPr/>
       <w:sdtContent>
@@ -334,7 +334,7 @@
           <w:r>
             <w:fldChar w:fldCharType="separate"/>
           </w:r>
-          <w:hyperlink w:anchor="_Toc240449860" w:history="1">
+          <w:hyperlink w:anchor="_Toc240449928" w:history="1">
             <w:r>
               <w:rPr>
                 <w:rStyle w:val="Hipervnculo"/>
@@ -358,7 +358,7 @@
               <w:rPr>
                 <w:noProof/>
               </w:rPr>
-              <w:instrText xml:space="preserve"> PAGEREF _Toc240449860 \h </w:instrText>
+              <w:instrText xml:space="preserve"> PAGEREF _Toc240449928 \h </w:instrText>
             </w:r>
             <w:r>
               <w:rPr>
@@ -400,7 +400,7 @@
               <w14:ligatures w14:val="standardContextual"/>
             </w:rPr>
           </w:pPr>
-          <w:hyperlink w:anchor="_Toc240449861" w:history="1">
+          <w:hyperlink w:anchor="_Toc240449929" w:history="1">
             <w:r>
               <w:rPr>
                 <w:rStyle w:val="Hipervnculo"/>
@@ -424,7 +424,7 @@
               <w:rPr>
                 <w:noProof/>
               </w:rPr>
-              <w:instrText xml:space="preserve"> PAGEREF _Toc240449861 \h </w:instrText>
+              <w:instrText xml:space="preserve"> PAGEREF _Toc240449929 \h </w:instrText>
             </w:r>
             <w:r>
               <w:rPr>
@@ -466,7 +466,7 @@
               <w14:ligatures w14:val="standardContextual"/>
             </w:rPr>
           </w:pPr>
-          <w:hyperlink w:anchor="_Toc240449862" w:history="1">
+          <w:hyperlink w:anchor="_Toc240449930" w:history="1">
             <w:r>
               <w:rPr>
                 <w:rStyle w:val="Hipervnculo"/>
@@ -490,7 +490,7 @@
               <w:rPr>
                 <w:noProof/>
               </w:rPr>
-              <w:instrText xml:space="preserve"> PAGEREF _Toc240449862 \h </w:instrText>
+              <w:instrText xml:space="preserve"> PAGEREF _Toc240449930 \h </w:instrText>
             </w:r>
             <w:r>
               <w:rPr>
@@ -532,7 +532,7 @@
               <w14:ligatures w14:val="standardContextual"/>
             </w:rPr>
           </w:pPr>
-          <w:hyperlink w:anchor="_Toc240449863" w:history="1">
+          <w:hyperlink w:anchor="_Toc240449931" w:history="1">
             <w:r>
               <w:rPr>
                 <w:rStyle w:val="Hipervnculo"/>
@@ -556,7 +556,7 @@
               <w:rPr>
                 <w:noProof/>
               </w:rPr>
-              <w:instrText xml:space="preserve"> PAGEREF _Toc240449863 \h </w:instrText>
+              <w:instrText xml:space="preserve"> PAGEREF _Toc240449931 \h </w:instrText>
             </w:r>
             <w:r>
               <w:rPr>
@@ -598,7 +598,7 @@
               <w14:ligatures w14:val="standardContextual"/>
             </w:rPr>
           </w:pPr>
-          <w:hyperlink w:anchor="_Toc240449864" w:history="1">
+          <w:hyperlink w:anchor="_Toc240449932" w:history="1">
             <w:r>
               <w:rPr>
                 <w:rStyle w:val="Hipervnculo"/>
@@ -622,7 +622,7 @@
               <w:rPr>
                 <w:noProof/>
               </w:rPr>
-              <w:instrText xml:space="preserve"> PAGEREF _Toc240449864 \h </w:instrText>
+              <w:instrText xml:space="preserve"> PAGEREF _Toc240449932 \h </w:instrText>
             </w:r>
             <w:r>
               <w:rPr>
@@ -664,7 +664,7 @@
               <w14:ligatures w14:val="standardContextual"/>
             </w:rPr>
           </w:pPr>
-          <w:hyperlink w:anchor="_Toc240449865" w:history="1">
+          <w:hyperlink w:anchor="_Toc240449933" w:history="1">
             <w:r>
               <w:rPr>
                 <w:rStyle w:val="Hipervnculo"/>
@@ -688,7 +688,7 @@
               <w:rPr>
                 <w:noProof/>
               </w:rPr>
-              <w:instrText xml:space="preserve"> PAGEREF _Toc240449865 \h </w:instrText>
+              <w:instrText xml:space="preserve"> PAGEREF _Toc240449933 \h </w:instrText>
             </w:r>
             <w:r>
               <w:rPr>
@@ -730,7 +730,7 @@
               <w14:ligatures w14:val="standardContextual"/>
             </w:rPr>
           </w:pPr>
-          <w:hyperlink w:anchor="_Toc240449866" w:history="1">
+          <w:hyperlink w:anchor="_Toc240449934" w:history="1">
             <w:r>
               <w:rPr>
                 <w:rStyle w:val="Hipervnculo"/>
@@ -754,7 +754,7 @@
               <w:rPr>
                 <w:noProof/>
               </w:rPr>
-              <w:instrText xml:space="preserve"> PAGEREF _Toc240449866 \h </w:instrText>
+              <w:instrText xml:space="preserve"> PAGEREF _Toc240449934 \h </w:instrText>
             </w:r>
             <w:r>
               <w:rPr>
@@ -796,7 +796,7 @@
               <w14:ligatures w14:val="standardContextual"/>
             </w:rPr>
           </w:pPr>
-          <w:hyperlink w:anchor="_Toc240449867" w:history="1">
+          <w:hyperlink w:anchor="_Toc240449935" w:history="1">
             <w:r>
               <w:rPr>
                 <w:rStyle w:val="Hipervnculo"/>
@@ -820,7 +820,7 @@
               <w:rPr>
                 <w:noProof/>
               </w:rPr>
-              <w:instrText xml:space="preserve"> PAGEREF _Toc240449867 \h </w:instrText>
+              <w:instrText xml:space="preserve"> PAGEREF _Toc240449935 \h </w:instrText>
             </w:r>
             <w:r>
               <w:rPr>
@@ -862,7 +862,7 @@
               <w14:ligatures w14:val="standardContextual"/>
             </w:rPr>
           </w:pPr>
-          <w:hyperlink w:anchor="_Toc240449868" w:history="1">
+          <w:hyperlink w:anchor="_Toc240449936" w:history="1">
             <w:r>
               <w:rPr>
                 <w:rStyle w:val="Hipervnculo"/>
@@ -886,7 +886,7 @@
               <w:rPr>
                 <w:noProof/>
               </w:rPr>
-              <w:instrText xml:space="preserve"> PAGEREF _Toc240449868 \h </w:instrText>
+              <w:instrText xml:space="preserve"> PAGEREF _Toc240449936 \h </w:instrText>
             </w:r>
             <w:r>
               <w:rPr>
@@ -928,7 +928,7 @@
               <w14:ligatures w14:val="standardContextual"/>
             </w:rPr>
           </w:pPr>
-          <w:hyperlink w:anchor="_Toc240449869" w:history="1">
+          <w:hyperlink w:anchor="_Toc240449937" w:history="1">
             <w:r>
               <w:rPr>
                 <w:rStyle w:val="Hipervnculo"/>
@@ -952,7 +952,7 @@
               <w:rPr>
                 <w:noProof/>
               </w:rPr>
-              <w:instrText xml:space="preserve"> PAGEREF _Toc240449869 \h </w:instrText>
+              <w:instrText xml:space="preserve"> PAGEREF _Toc240449937 \h </w:instrText>
             </w:r>
             <w:r>
               <w:rPr>
@@ -994,7 +994,7 @@
               <w14:ligatures w14:val="standardContextual"/>
             </w:rPr>
           </w:pPr>
-          <w:hyperlink w:anchor="_Toc240449870" w:history="1">
+          <w:hyperlink w:anchor="_Toc240449938" w:history="1">
             <w:r>
               <w:rPr>
                 <w:rStyle w:val="Hipervnculo"/>
@@ -1018,7 +1018,7 @@
               <w:rPr>
                 <w:noProof/>
               </w:rPr>
-              <w:instrText xml:space="preserve"> PAGEREF _Toc240449870 \h </w:instrText>
+              <w:instrText xml:space="preserve"> PAGEREF _Toc240449938 \h </w:instrText>
             </w:r>
             <w:r>
               <w:rPr>
@@ -1060,7 +1060,7 @@
               <w14:ligatures w14:val="standardContextual"/>
             </w:rPr>
           </w:pPr>
-          <w:hyperlink w:anchor="_Toc240449871" w:history="1">
+          <w:hyperlink w:anchor="_Toc240449939" w:history="1">
             <w:r>
               <w:rPr>
                 <w:rStyle w:val="Hipervnculo"/>
@@ -1084,7 +1084,7 @@
               <w:rPr>
                 <w:noProof/>
               </w:rPr>
-              <w:instrText xml:space="preserve"> PAGEREF _Toc240449871 \h </w:instrText>
+              <w:instrText xml:space="preserve"> PAGEREF _Toc240449939 \h </w:instrText>
             </w:r>
             <w:r>
               <w:rPr>
@@ -1126,7 +1126,7 @@
               <w14:ligatures w14:val="standardContextual"/>
             </w:rPr>
           </w:pPr>
-          <w:hyperlink w:anchor="_Toc240449872" w:history="1">
+          <w:hyperlink w:anchor="_Toc240449940" w:history="1">
             <w:r>
               <w:rPr>
                 <w:rStyle w:val="Hipervnculo"/>
@@ -1150,7 +1150,7 @@
               <w:rPr>
                 <w:noProof/>
               </w:rPr>
-              <w:instrText xml:space="preserve"> PAGEREF _Toc240449872 \h </w:instrText>
+              <w:instrText xml:space="preserve"> PAGEREF _Toc240449940 \h </w:instrText>
             </w:r>
             <w:r>
               <w:rPr>
@@ -1192,7 +1192,7 @@
               <w14:ligatures w14:val="standardContextual"/>
             </w:rPr>
           </w:pPr>
-          <w:hyperlink w:anchor="_Toc240449873" w:history="1">
+          <w:hyperlink w:anchor="_Toc240449941" w:history="1">
             <w:r>
               <w:rPr>
                 <w:rStyle w:val="Hipervnculo"/>
@@ -1216,7 +1216,7 @@
               <w:rPr>
                 <w:noProof/>
               </w:rPr>
-              <w:instrText xml:space="preserve"> PAGEREF _Toc240449873 \h </w:instrText>
+              <w:instrText xml:space="preserve"> PAGEREF _Toc240449941 \h </w:instrText>
             </w:r>
             <w:r>
               <w:rPr>
@@ -1258,7 +1258,7 @@
               <w14:ligatures w14:val="standardContextual"/>
             </w:rPr>
           </w:pPr>
-          <w:hyperlink w:anchor="_Toc240449874" w:history="1">
+          <w:hyperlink w:anchor="_Toc240449942" w:history="1">
             <w:r>
               <w:rPr>
                 <w:rStyle w:val="Hipervnculo"/>
@@ -1282,7 +1282,7 @@
               <w:rPr>
                 <w:noProof/>
               </w:rPr>
-              <w:instrText xml:space="preserve"> PAGEREF _Toc240449874 \h </w:instrText>
+              <w:instrText xml:space="preserve"> PAGEREF _Toc240449942 \h </w:instrText>
             </w:r>
             <w:r>
               <w:rPr>
@@ -1324,7 +1324,7 @@
               <w14:ligatures w14:val="standardContextual"/>
             </w:rPr>
           </w:pPr>
-          <w:hyperlink w:anchor="_Toc240449875" w:history="1">
+          <w:hyperlink w:anchor="_Toc240449943" w:history="1">
             <w:r>
               <w:rPr>
                 <w:rStyle w:val="Hipervnculo"/>
@@ -1348,7 +1348,7 @@
               <w:rPr>
                 <w:noProof/>
               </w:rPr>
-              <w:instrText xml:space="preserve"> PAGEREF _Toc240449875 \h </w:instrText>
+              <w:instrText xml:space="preserve"> PAGEREF _Toc240449943 \h </w:instrText>
             </w:r>
             <w:r>
               <w:rPr>
@@ -1390,7 +1390,7 @@
               <w14:ligatures w14:val="standardContextual"/>
             </w:rPr>
           </w:pPr>
-          <w:hyperlink w:anchor="_Toc240449876" w:history="1">
+          <w:hyperlink w:anchor="_Toc240449944" w:history="1">
             <w:r>
               <w:rPr>
                 <w:rStyle w:val="Hipervnculo"/>
@@ -1414,7 +1414,7 @@
               <w:rPr>
                 <w:noProof/>
               </w:rPr>
-              <w:instrText xml:space="preserve"> PAGEREF _Toc240449876 \h </w:instrText>
+              <w:instrText xml:space="preserve"> PAGEREF _Toc240449944 \h </w:instrText>
             </w:r>
             <w:r>
               <w:rPr>
@@ -1456,7 +1456,7 @@
               <w14:ligatures w14:val="standardContextual"/>
             </w:rPr>
           </w:pPr>
-          <w:hyperlink w:anchor="_Toc240449877" w:history="1">
+          <w:hyperlink w:anchor="_Toc240449945" w:history="1">
             <w:r>
               <w:rPr>
                 <w:rStyle w:val="Hipervnculo"/>
@@ -1480,7 +1480,7 @@
               <w:rPr>
                 <w:noProof/>
               </w:rPr>
-              <w:instrText xml:space="preserve"> PAGEREF _Toc240449877 \h </w:instrText>
+              <w:instrText xml:space="preserve"> PAGEREF _Toc240449945 \h </w:instrText>
             </w:r>
             <w:r>
               <w:rPr>
@@ -1497,7 +1497,7 @@
               <w:rPr>
                 <w:noProof/>
               </w:rPr>
-              <w:t>10</w:t>
+              <w:t>11</w:t>
             </w:r>
             <w:r>
               <w:rPr>
@@ -1523,7 +1523,7 @@
       <w:pPr>
         <w:pStyle w:val="Ttulo1"/>
       </w:pPr>
-      <w:bookmarkStart w:id="0" w:name="_Toc240449860"/>
+      <w:bookmarkStart w:id="0" w:name="_Toc240449928"/>
       <w:r>
         <w:t>1. INTRODUCCIÓN</w:t>
       </w:r>
@@ -1560,7 +1560,7 @@
       <w:pPr>
         <w:pStyle w:val="Ttulo1"/>
       </w:pPr>
-      <w:bookmarkStart w:id="1" w:name="_Toc240449861"/>
+      <w:bookmarkStart w:id="1" w:name="_Toc240449929"/>
       <w:r>
         <w:t>2. LOS DATOS</w:t>
       </w:r>
@@ -1570,7 +1570,7 @@
       <w:pPr>
         <w:pStyle w:val="Ttulo2"/>
       </w:pPr>
-      <w:bookmarkStart w:id="2" w:name="_Toc240449862"/>
+      <w:bookmarkStart w:id="2" w:name="_Toc240449930"/>
       <w:r>
         <w:t>2.1 Descripción de las variables</w:t>
       </w:r>
@@ -1614,7 +1614,7 @@
           <w:left w:w="10" w:type="dxa"/>
           <w:right w:w="10" w:type="dxa"/>
         </w:tblCellMar>
-        <w:tblLook w:val="04A0" w:firstRow="1" w:lastRow="0" w:firstColumn="1" w:lastColumn="0" w:noHBand="0" w:noVBand="1"/>
+        <w:tblLook w:val="0000" w:firstRow="0" w:lastRow="0" w:firstColumn="0" w:lastColumn="0" w:noHBand="0" w:noVBand="0"/>
       </w:tblPr>
       <w:tblGrid>
         <w:gridCol w:w="1700"/>
@@ -2265,7 +2265,7 @@
       <w:pPr>
         <w:pStyle w:val="Ttulo2"/>
       </w:pPr>
-      <w:bookmarkStart w:id="3" w:name="_Toc240449863"/>
+      <w:bookmarkStart w:id="3" w:name="_Toc240449931"/>
       <w:r>
         <w:t>2.2 Calidad de los datos</w:t>
       </w:r>
@@ -2304,10 +2304,10 @@
           <w:noProof/>
         </w:rPr>
         <w:drawing>
-          <wp:inline distT="0" distB="0" distL="0" distR="0" wp14:anchorId="265480D3" wp14:editId="12DEDB92">
+          <wp:inline distT="0" distB="0" distL="0" distR="0" wp14:anchorId="63BE37E2" wp14:editId="1372D7F5">
             <wp:extent cx="5667375" cy="2038350"/>
             <wp:effectExtent l="0" t="0" r="0" b="0"/>
-            <wp:docPr id="1096839477" name="Imagen 1096839477"/>
+            <wp:docPr id="477094578" name="Imagen 477094578"/>
             <wp:cNvGraphicFramePr>
               <a:graphicFrameLocks xmlns:a="http://schemas.openxmlformats.org/drawingml/2006/main" noChangeAspect="1"/>
             </wp:cNvGraphicFramePr>
@@ -2362,7 +2362,7 @@
       <w:pPr>
         <w:pStyle w:val="Ttulo1"/>
       </w:pPr>
-      <w:bookmarkStart w:id="4" w:name="_Toc240449864"/>
+      <w:bookmarkStart w:id="4" w:name="_Toc240449932"/>
       <w:r>
         <w:t>3. ANÁLISIS EXPLORATORIO DE LOS DATOS</w:t>
       </w:r>
@@ -2401,10 +2401,10 @@
           <w:noProof/>
         </w:rPr>
         <w:drawing>
-          <wp:inline distT="0" distB="0" distL="0" distR="0" wp14:anchorId="0A9A3D5E" wp14:editId="5A310402">
+          <wp:inline distT="0" distB="0" distL="0" distR="0" wp14:anchorId="37D39956" wp14:editId="4BAE4F15">
             <wp:extent cx="4933950" cy="3505200"/>
             <wp:effectExtent l="0" t="0" r="0" b="0"/>
-            <wp:docPr id="1121393429" name="Imagen 1121393429"/>
+            <wp:docPr id="1262192582" name="Imagen 1262192582"/>
             <wp:cNvGraphicFramePr>
               <a:graphicFrameLocks xmlns:a="http://schemas.openxmlformats.org/drawingml/2006/main" noChangeAspect="1"/>
             </wp:cNvGraphicFramePr>
@@ -2531,10 +2531,10 @@
           <w:noProof/>
         </w:rPr>
         <w:drawing>
-          <wp:inline distT="0" distB="0" distL="0" distR="0" wp14:anchorId="257397CC" wp14:editId="5E932322">
+          <wp:inline distT="0" distB="0" distL="0" distR="0" wp14:anchorId="791CC678" wp14:editId="5FF6F4BC">
             <wp:extent cx="5124450" cy="4572000"/>
             <wp:effectExtent l="0" t="0" r="0" b="0"/>
-            <wp:docPr id="1494429758" name="Imagen 1494429758"/>
+            <wp:docPr id="518635268" name="Imagen 518635268"/>
             <wp:cNvGraphicFramePr>
               <a:graphicFrameLocks xmlns:a="http://schemas.openxmlformats.org/drawingml/2006/main" noChangeAspect="1"/>
             </wp:cNvGraphicFramePr>
@@ -2637,7 +2637,7 @@
       <w:pPr>
         <w:pStyle w:val="Ttulo1"/>
       </w:pPr>
-      <w:bookmarkStart w:id="5" w:name="_Toc240449865"/>
+      <w:bookmarkStart w:id="5" w:name="_Toc240449933"/>
       <w:r>
         <w:t>4. PREPARACIÓN DE LOS DATOS</w:t>
       </w:r>
@@ -2647,7 +2647,7 @@
       <w:pPr>
         <w:pStyle w:val="Ttulo2"/>
       </w:pPr>
-      <w:bookmarkStart w:id="6" w:name="_Toc240449866"/>
+      <w:bookmarkStart w:id="6" w:name="_Toc240449934"/>
       <w:r>
         <w:t>4.1 Columnas eliminadas y baja varianza</w:t>
       </w:r>
@@ -2678,7 +2678,7 @@
       <w:pPr>
         <w:pStyle w:val="Ttulo2"/>
       </w:pPr>
-      <w:bookmarkStart w:id="7" w:name="_Toc240449867"/>
+      <w:bookmarkStart w:id="7" w:name="_Toc240449935"/>
       <w:r>
         <w:t>4.2 Tipos de variables y su tratamiento</w:t>
       </w:r>
@@ -2706,7 +2706,7 @@
       <w:pPr>
         <w:pStyle w:val="Ttulo2"/>
       </w:pPr>
-      <w:bookmarkStart w:id="8" w:name="_Toc240449868"/>
+      <w:bookmarkStart w:id="8" w:name="_Toc240449936"/>
       <w:r>
         <w:t>4.3 Grupo de examen y data leakage</w:t>
       </w:r>
@@ -2728,7 +2728,7 @@
       <w:pPr>
         <w:pStyle w:val="Ttulo2"/>
       </w:pPr>
-      <w:bookmarkStart w:id="9" w:name="_Toc240449869"/>
+      <w:bookmarkStart w:id="9" w:name="_Toc240449937"/>
       <w:r>
         <w:t>4.4 Pipeline de preprocesamiento</w:t>
       </w:r>
@@ -2750,7 +2750,7 @@
       <w:pPr>
         <w:pStyle w:val="Ttulo2"/>
       </w:pPr>
-      <w:bookmarkStart w:id="10" w:name="_Toc240449870"/>
+      <w:bookmarkStart w:id="10" w:name="_Toc240449938"/>
       <w:r>
         <w:t>4.5 Balance de clases</w:t>
       </w:r>
@@ -2772,7 +2772,7 @@
       <w:pPr>
         <w:pStyle w:val="Ttulo2"/>
       </w:pPr>
-      <w:bookmarkStart w:id="11" w:name="_Toc240449871"/>
+      <w:bookmarkStart w:id="11" w:name="_Toc240449939"/>
       <w:r>
         <w:t>4.6 Transformaciones y componentes principales</w:t>
       </w:r>
@@ -2820,10 +2820,10 @@
           <w:noProof/>
         </w:rPr>
         <w:drawing>
-          <wp:inline distT="0" distB="0" distL="0" distR="0" wp14:anchorId="4DB7A7C4" wp14:editId="19ABF0EF">
+          <wp:inline distT="0" distB="0" distL="0" distR="0" wp14:anchorId="2017B5FA" wp14:editId="48ACFDF4">
             <wp:extent cx="4933950" cy="2657475"/>
             <wp:effectExtent l="0" t="0" r="0" b="0"/>
-            <wp:docPr id="1473097034" name="Imagen 1473097034"/>
+            <wp:docPr id="1936149886" name="Imagen 1936149886"/>
             <wp:cNvGraphicFramePr>
               <a:graphicFrameLocks xmlns:a="http://schemas.openxmlformats.org/drawingml/2006/main" noChangeAspect="1"/>
             </wp:cNvGraphicFramePr>
@@ -2878,7 +2878,7 @@
       <w:pPr>
         <w:pStyle w:val="Ttulo2"/>
       </w:pPr>
-      <w:bookmarkStart w:id="12" w:name="_Toc240449872"/>
+      <w:bookmarkStart w:id="12" w:name="_Toc240449940"/>
       <w:r>
         <w:t>4.7 Ranking de variables</w:t>
       </w:r>
@@ -2920,10 +2920,10 @@
           <w:noProof/>
         </w:rPr>
         <w:drawing>
-          <wp:inline distT="0" distB="0" distL="0" distR="0" wp14:anchorId="7446B56C" wp14:editId="57AADDB4">
+          <wp:inline distT="0" distB="0" distL="0" distR="0" wp14:anchorId="2F975415" wp14:editId="5B816652">
             <wp:extent cx="4933950" cy="3009900"/>
             <wp:effectExtent l="0" t="0" r="0" b="0"/>
-            <wp:docPr id="1505895859" name="Imagen 1505895859"/>
+            <wp:docPr id="1951251995" name="Imagen 1951251995"/>
             <wp:cNvGraphicFramePr>
               <a:graphicFrameLocks xmlns:a="http://schemas.openxmlformats.org/drawingml/2006/main" noChangeAspect="1"/>
             </wp:cNvGraphicFramePr>
@@ -2978,7 +2978,7 @@
       <w:pPr>
         <w:pStyle w:val="Ttulo2"/>
       </w:pPr>
-      <w:bookmarkStart w:id="13" w:name="_Toc240449873"/>
+      <w:bookmarkStart w:id="13" w:name="_Toc240449941"/>
       <w:r>
         <w:t>4.8 Dataset final</w:t>
       </w:r>
@@ -2997,7 +2997,7 @@
       <w:pPr>
         <w:pStyle w:val="Ttulo1"/>
       </w:pPr>
-      <w:bookmarkStart w:id="14" w:name="_Toc240449874"/>
+      <w:bookmarkStart w:id="14" w:name="_Toc240449942"/>
       <w:r>
         <w:t>5. BASELINE</w:t>
       </w:r>
@@ -3041,7 +3041,7 @@
           <w:left w:w="10" w:type="dxa"/>
           <w:right w:w="10" w:type="dxa"/>
         </w:tblCellMar>
-        <w:tblLook w:val="04A0" w:firstRow="1" w:lastRow="0" w:firstColumn="1" w:lastColumn="0" w:noHBand="0" w:noVBand="1"/>
+        <w:tblLook w:val="0000" w:firstRow="0" w:lastRow="0" w:firstColumn="0" w:lastColumn="0" w:noHBand="0" w:noVBand="0"/>
       </w:tblPr>
       <w:tblGrid>
         <w:gridCol w:w="2900"/>
@@ -3361,7 +3361,7 @@
       <w:pPr>
         <w:pStyle w:val="Ttulo1"/>
       </w:pPr>
-      <w:bookmarkStart w:id="15" w:name="_Toc240449875"/>
+      <w:bookmarkStart w:id="15" w:name="_Toc240449943"/>
       <w:r>
         <w:t>6. CONCLUSIONES</w:t>
       </w:r>
@@ -3408,7 +3408,7 @@
           <w:left w:w="10" w:type="dxa"/>
           <w:right w:w="10" w:type="dxa"/>
         </w:tblCellMar>
-        <w:tblLook w:val="04A0" w:firstRow="1" w:lastRow="0" w:firstColumn="1" w:lastColumn="0" w:noHBand="0" w:noVBand="1"/>
+        <w:tblLook w:val="0000" w:firstRow="0" w:lastRow="0" w:firstColumn="0" w:lastColumn="0" w:noHBand="0" w:noVBand="0"/>
       </w:tblPr>
       <w:tblGrid>
         <w:gridCol w:w="3000"/>
@@ -4124,7 +4124,7 @@
       <w:pPr>
         <w:pStyle w:val="Ttulo1"/>
       </w:pPr>
-      <w:bookmarkStart w:id="16" w:name="_Toc240449876"/>
+      <w:bookmarkStart w:id="16" w:name="_Toc240449944"/>
       <w:r>
         <w:t>7. LINK COLAB</w:t>
       </w:r>
@@ -4157,7 +4157,7 @@
       <w:pPr>
         <w:pStyle w:val="Ttulo1"/>
       </w:pPr>
-      <w:bookmarkStart w:id="17" w:name="_Toc240449877"/>
+      <w:bookmarkStart w:id="17" w:name="_Toc240449945"/>
       <w:r>
         <w:t>8. REFERENCIAS</w:t>
       </w:r>
@@ -4166,6 +4166,8 @@
     <w:p>
       <w:pPr>
         <w:pStyle w:val="Prrafodelista"/>
+        <w:keepNext/>
+        <w:keepLines/>
         <w:numPr>
           <w:ilvl w:val="0"/>
           <w:numId w:val="2"/>
@@ -4179,6 +4181,8 @@
     <w:p>
       <w:pPr>
         <w:pStyle w:val="Prrafodelista"/>
+        <w:keepNext/>
+        <w:keepLines/>
         <w:numPr>
           <w:ilvl w:val="0"/>
           <w:numId w:val="2"/>
@@ -4192,6 +4196,7 @@
     <w:p>
       <w:pPr>
         <w:pStyle w:val="Prrafodelista"/>
+        <w:keepLines/>
         <w:numPr>
           <w:ilvl w:val="0"/>
           <w:numId w:val="2"/>
@@ -4300,96 +4305,10 @@
 <file path=word/numbering.xml><?xml version="1.0" encoding="utf-8"?>
 <w:numbering xmlns:wpc="http://schemas.microsoft.com/office/word/2010/wordprocessingCanvas" xmlns:cx="http://schemas.microsoft.com/office/drawing/2014/chartex" xmlns:cx1="http://schemas.microsoft.com/office/drawing/2015/9/8/chartex" xmlns:cx2="http://schemas.microsoft.com/office/drawing/2015/10/21/chartex" xmlns:cx3="http://schemas.microsoft.com/office/drawing/2016/5/9/chartex" xmlns:cx4="http://schemas.microsoft.com/office/drawing/2016/5/10/chartex" xmlns:cx5="http://schemas.microsoft.com/office/drawing/2016/5/11/chartex" xmlns:cx6="http://schemas.microsoft.com/office/drawing/2016/5/12/chartex" xmlns:cx7="http://schemas.microsoft.com/office/drawing/2016/5/13/chartex" xmlns:cx8="http://schemas.microsoft.com/office/drawing/2016/5/14/chartex" xmlns:mc="http://schemas.openxmlformats.org/markup-compatibility/2006" xmlns:aink="http://schemas.microsoft.com/office/drawing/2016/ink" xmlns:am3d="http://schemas.microsoft.com/office/drawing/2017/model3d" xmlns:o="urn:schemas-microsoft-com:office:office" xmlns:oel="http://schemas.microsoft.com/office/2019/extlst" xmlns:r="http://schemas.openxmlformats.org/officeDocument/2006/relationships" xmlns:m="http://schemas.openxmlformats.org/officeDocument/2006/math" xmlns:v="urn:schemas-microsoft-com:vml" xmlns:wp14="http://schemas.microsoft.com/office/word/2010/wordprocessingDrawing" xmlns:wp="http://schemas.openxmlformats.org/drawingml/2006/wordprocessingDrawing" xmlns:w10="urn:schemas-microsoft-com:office:word" xmlns:w="http://schemas.openxmlformats.org/wordprocessingml/2006/main" xmlns:w14="http://schemas.microsoft.com/office/word/2010/wordml" xmlns:w15="http://schemas.microsoft.com/office/word/2012/wordml" xmlns:w16cex="http://schemas.microsoft.com/office/word/2018/wordml/cex" xmlns:w16cid="http://schemas.microsoft.com/office/word/2016/wordml/cid" xmlns:w16="http://schemas.microsoft.com/office/word/2018/wordml" xmlns:w16du="http://schemas.microsoft.com/office/word/2023/wordml/word16du" xmlns:w16sdtdh="http://schemas.microsoft.com/office/word/2020/wordml/sdtdatahash" xmlns:w16sdtfl="http://schemas.microsoft.com/office/word/2024/wordml/sdtformatlock" xmlns:w16se="http://schemas.microsoft.com/office/word/2015/wordml/symex" xmlns:wpg="http://schemas.microsoft.com/office/word/2010/wordprocessingGroup" xmlns:wpi="http://schemas.microsoft.com/office/word/2010/wordprocessingInk" xmlns:wne="http://schemas.microsoft.com/office/word/2006/wordml" xmlns:wps="http://schemas.microsoft.com/office/word/2010/wordprocessingShape" mc:Ignorable="w14 w15 w16se w16cid w16 w16cex w16sdtdh w16sdtfl w16du wp14">
   <w:abstractNum w:abstractNumId="0" w15:restartNumberingAfterBreak="0">
-    <w:nsid w:val="417C721C"/>
+    <w:nsid w:val="6C985C21"/>
     <w:multiLevelType w:val="hybridMultilevel"/>
-    <w:tmpl w:val="DF78B1C4"/>
-    <w:lvl w:ilvl="0" w:tplc="2C7E391A">
-      <w:start w:val="1"/>
-      <w:numFmt w:val="bullet"/>
-      <w:lvlText w:val="●"/>
-      <w:lvlJc w:val="left"/>
-      <w:pPr>
-        <w:ind w:left="720" w:hanging="360"/>
-      </w:pPr>
-    </w:lvl>
-    <w:lvl w:ilvl="1" w:tplc="E1B8D16A">
-      <w:start w:val="1"/>
-      <w:numFmt w:val="bullet"/>
-      <w:lvlText w:val="○"/>
-      <w:lvlJc w:val="left"/>
-      <w:pPr>
-        <w:ind w:left="1440" w:hanging="360"/>
-      </w:pPr>
-    </w:lvl>
-    <w:lvl w:ilvl="2" w:tplc="731C7512">
-      <w:start w:val="1"/>
-      <w:numFmt w:val="bullet"/>
-      <w:lvlText w:val="■"/>
-      <w:lvlJc w:val="left"/>
-      <w:pPr>
-        <w:ind w:left="2160" w:hanging="360"/>
-      </w:pPr>
-    </w:lvl>
-    <w:lvl w:ilvl="3" w:tplc="8F682626">
-      <w:start w:val="1"/>
-      <w:numFmt w:val="bullet"/>
-      <w:lvlText w:val="●"/>
-      <w:lvlJc w:val="left"/>
-      <w:pPr>
-        <w:ind w:left="2880" w:hanging="360"/>
-      </w:pPr>
-    </w:lvl>
-    <w:lvl w:ilvl="4" w:tplc="E246565C">
-      <w:start w:val="1"/>
-      <w:numFmt w:val="bullet"/>
-      <w:lvlText w:val="○"/>
-      <w:lvlJc w:val="left"/>
-      <w:pPr>
-        <w:ind w:left="3600" w:hanging="360"/>
-      </w:pPr>
-    </w:lvl>
-    <w:lvl w:ilvl="5" w:tplc="927AC19A">
-      <w:start w:val="1"/>
-      <w:numFmt w:val="bullet"/>
-      <w:lvlText w:val="■"/>
-      <w:lvlJc w:val="left"/>
-      <w:pPr>
-        <w:ind w:left="4320" w:hanging="360"/>
-      </w:pPr>
-    </w:lvl>
-    <w:lvl w:ilvl="6" w:tplc="A8846286">
-      <w:start w:val="1"/>
-      <w:numFmt w:val="bullet"/>
-      <w:lvlText w:val="●"/>
-      <w:lvlJc w:val="left"/>
-      <w:pPr>
-        <w:ind w:left="5040" w:hanging="360"/>
-      </w:pPr>
-    </w:lvl>
-    <w:lvl w:ilvl="7" w:tplc="06B0DE76">
-      <w:start w:val="1"/>
-      <w:numFmt w:val="bullet"/>
-      <w:lvlText w:val="●"/>
-      <w:lvlJc w:val="left"/>
-      <w:pPr>
-        <w:ind w:left="5760" w:hanging="360"/>
-      </w:pPr>
-    </w:lvl>
-    <w:lvl w:ilvl="8" w:tplc="0D4A2B94">
-      <w:start w:val="1"/>
-      <w:numFmt w:val="bullet"/>
-      <w:lvlText w:val="●"/>
-      <w:lvlJc w:val="left"/>
-      <w:pPr>
-        <w:ind w:left="6480" w:hanging="360"/>
-      </w:pPr>
-    </w:lvl>
-  </w:abstractNum>
-  <w:abstractNum w:abstractNumId="1" w15:restartNumberingAfterBreak="0">
-    <w:nsid w:val="4ECF14C7"/>
-    <w:multiLevelType w:val="hybridMultilevel"/>
-    <w:tmpl w:val="8C786F16"/>
-    <w:lvl w:ilvl="0" w:tplc="08CE0BAA">
+    <w:tmpl w:val="3F4A876A"/>
+    <w:lvl w:ilvl="0" w:tplc="54466026">
       <w:start w:val="1"/>
       <w:numFmt w:val="bullet"/>
       <w:lvlText w:val="•"/>
@@ -4398,55 +4317,141 @@
         <w:ind w:left="720" w:hanging="360"/>
       </w:pPr>
     </w:lvl>
-    <w:lvl w:ilvl="1" w:tplc="D88E3C8C">
+    <w:lvl w:ilvl="1" w:tplc="25D48CBE">
       <w:numFmt w:val="decimal"/>
       <w:lvlText w:val=""/>
       <w:lvlJc w:val="left"/>
     </w:lvl>
-    <w:lvl w:ilvl="2" w:tplc="3704198A">
+    <w:lvl w:ilvl="2" w:tplc="FB5EEAFA">
       <w:numFmt w:val="decimal"/>
       <w:lvlText w:val=""/>
       <w:lvlJc w:val="left"/>
     </w:lvl>
-    <w:lvl w:ilvl="3" w:tplc="43405EAA">
+    <w:lvl w:ilvl="3" w:tplc="F9B2BF14">
       <w:numFmt w:val="decimal"/>
       <w:lvlText w:val=""/>
       <w:lvlJc w:val="left"/>
     </w:lvl>
-    <w:lvl w:ilvl="4" w:tplc="2062AAB4">
+    <w:lvl w:ilvl="4" w:tplc="D4CE7456">
       <w:numFmt w:val="decimal"/>
       <w:lvlText w:val=""/>
       <w:lvlJc w:val="left"/>
     </w:lvl>
-    <w:lvl w:ilvl="5" w:tplc="3F10B300">
+    <w:lvl w:ilvl="5" w:tplc="9DC61CDA">
       <w:numFmt w:val="decimal"/>
       <w:lvlText w:val=""/>
       <w:lvlJc w:val="left"/>
     </w:lvl>
-    <w:lvl w:ilvl="6" w:tplc="9F922B9C">
+    <w:lvl w:ilvl="6" w:tplc="22EC2D72">
       <w:numFmt w:val="decimal"/>
       <w:lvlText w:val=""/>
       <w:lvlJc w:val="left"/>
     </w:lvl>
-    <w:lvl w:ilvl="7" w:tplc="4F7CC958">
+    <w:lvl w:ilvl="7" w:tplc="FAF41E30">
       <w:numFmt w:val="decimal"/>
       <w:lvlText w:val=""/>
       <w:lvlJc w:val="left"/>
     </w:lvl>
-    <w:lvl w:ilvl="8" w:tplc="D80C06F6">
+    <w:lvl w:ilvl="8" w:tplc="6FF6B238">
       <w:numFmt w:val="decimal"/>
       <w:lvlText w:val=""/>
       <w:lvlJc w:val="left"/>
     </w:lvl>
   </w:abstractNum>
-  <w:num w:numId="1" w16cid:durableId="149951890">
-    <w:abstractNumId w:val="0"/>
+  <w:abstractNum w:abstractNumId="1" w15:restartNumberingAfterBreak="0">
+    <w:nsid w:val="7D4F1E12"/>
+    <w:multiLevelType w:val="hybridMultilevel"/>
+    <w:tmpl w:val="11A407CA"/>
+    <w:lvl w:ilvl="0" w:tplc="285231D8">
+      <w:start w:val="1"/>
+      <w:numFmt w:val="bullet"/>
+      <w:lvlText w:val="●"/>
+      <w:lvlJc w:val="left"/>
+      <w:pPr>
+        <w:ind w:left="720" w:hanging="360"/>
+      </w:pPr>
+    </w:lvl>
+    <w:lvl w:ilvl="1" w:tplc="B882F794">
+      <w:start w:val="1"/>
+      <w:numFmt w:val="bullet"/>
+      <w:lvlText w:val="○"/>
+      <w:lvlJc w:val="left"/>
+      <w:pPr>
+        <w:ind w:left="1440" w:hanging="360"/>
+      </w:pPr>
+    </w:lvl>
+    <w:lvl w:ilvl="2" w:tplc="A5A2DDFA">
+      <w:start w:val="1"/>
+      <w:numFmt w:val="bullet"/>
+      <w:lvlText w:val="■"/>
+      <w:lvlJc w:val="left"/>
+      <w:pPr>
+        <w:ind w:left="2160" w:hanging="360"/>
+      </w:pPr>
+    </w:lvl>
+    <w:lvl w:ilvl="3" w:tplc="3CCCCB90">
+      <w:start w:val="1"/>
+      <w:numFmt w:val="bullet"/>
+      <w:lvlText w:val="●"/>
+      <w:lvlJc w:val="left"/>
+      <w:pPr>
+        <w:ind w:left="2880" w:hanging="360"/>
+      </w:pPr>
+    </w:lvl>
+    <w:lvl w:ilvl="4" w:tplc="FD7C4026">
+      <w:start w:val="1"/>
+      <w:numFmt w:val="bullet"/>
+      <w:lvlText w:val="○"/>
+      <w:lvlJc w:val="left"/>
+      <w:pPr>
+        <w:ind w:left="3600" w:hanging="360"/>
+      </w:pPr>
+    </w:lvl>
+    <w:lvl w:ilvl="5" w:tplc="4C6C5DD2">
+      <w:start w:val="1"/>
+      <w:numFmt w:val="bullet"/>
+      <w:lvlText w:val="■"/>
+      <w:lvlJc w:val="left"/>
+      <w:pPr>
+        <w:ind w:left="4320" w:hanging="360"/>
+      </w:pPr>
+    </w:lvl>
+    <w:lvl w:ilvl="6" w:tplc="C2967486">
+      <w:start w:val="1"/>
+      <w:numFmt w:val="bullet"/>
+      <w:lvlText w:val="●"/>
+      <w:lvlJc w:val="left"/>
+      <w:pPr>
+        <w:ind w:left="5040" w:hanging="360"/>
+      </w:pPr>
+    </w:lvl>
+    <w:lvl w:ilvl="7" w:tplc="A7EA5A5A">
+      <w:start w:val="1"/>
+      <w:numFmt w:val="bullet"/>
+      <w:lvlText w:val="●"/>
+      <w:lvlJc w:val="left"/>
+      <w:pPr>
+        <w:ind w:left="5760" w:hanging="360"/>
+      </w:pPr>
+    </w:lvl>
+    <w:lvl w:ilvl="8" w:tplc="C99AB010">
+      <w:start w:val="1"/>
+      <w:numFmt w:val="bullet"/>
+      <w:lvlText w:val="●"/>
+      <w:lvlJc w:val="left"/>
+      <w:pPr>
+        <w:ind w:left="6480" w:hanging="360"/>
+      </w:pPr>
+    </w:lvl>
+  </w:abstractNum>
+  <w:num w:numId="1" w16cid:durableId="1037195104">
+    <w:abstractNumId w:val="1"/>
     <w:lvlOverride w:ilvl="0">
       <w:startOverride w:val="1"/>
     </w:lvlOverride>
   </w:num>
-  <w:num w:numId="2" w16cid:durableId="938029991">
-    <w:abstractNumId w:val="1"/>
+  <w:num w:numId="2" w16cid:durableId="671764896">
+    <w:abstractNumId w:val="0"/>
     <w:lvlOverride w:ilvl="0">
       <w:startOverride w:val="1"/>
     </w:lvlOverride>
@@ -5066,7 +5071,7 @@
     <w:autoRedefine/>
     <w:uiPriority w:val="39"/>
     <w:unhideWhenUsed/>
-    <w:rsid w:val="00F47959"/>
+    <w:rsid w:val="002051EC"/>
     <w:pPr>
       <w:spacing w:after="100"/>
     </w:pPr>
@@ -5078,7 +5083,7 @@
     <w:autoRedefine/>
     <w:uiPriority w:val="39"/>
     <w:unhideWhenUsed/>
-    <w:rsid w:val="00F47959"/>
+    <w:rsid w:val="002051EC"/>
     <w:pPr>
       <w:spacing w:after="100"/>
       <w:ind w:left="220"/>

</xml_diff>